<commit_message>
Update Setup Guide with Dataverse table permissions section
</commit_message>
<xml_diff>
--- a/Request Tracker/Request Tracker Agent - Setup Guide.docx
+++ b/Request Tracker/Request Tracker Agent - Setup Guide.docx
@@ -124,27 +124,7 @@
           <w:sz w:val="22"/>
           <w:szCs w:val="22"/>
         </w:rPr>
-        <w:t xml:space="preserve">Developer: Power </w:t>
-      </w:r>
-      <w:proofErr w:type="gramStart"/>
-      <w:r>
-        <w:rPr>
-          <w:rFonts w:ascii="Segoe UI" w:eastAsia="Segoe UI" w:hAnsi="Segoe UI" w:cs="Segoe UI"/>
-          <w:color w:val="333333"/>
-          <w:sz w:val="22"/>
-          <w:szCs w:val="22"/>
-        </w:rPr>
-        <w:t>CAT  |</w:t>
-      </w:r>
-      <w:proofErr w:type="gramEnd"/>
-      <w:r>
-        <w:rPr>
-          <w:rFonts w:ascii="Segoe UI" w:eastAsia="Segoe UI" w:hAnsi="Segoe UI" w:cs="Segoe UI"/>
-          <w:color w:val="333333"/>
-          <w:sz w:val="22"/>
-          <w:szCs w:val="22"/>
-        </w:rPr>
-        <w:t xml:space="preserve">  Version 1.0.0.0</w:t>
+        <w:t>Developer: Power CAT  |  Version 1.0.0.0</w:t>
       </w:r>
     </w:p>
     <w:p>
@@ -1081,27 +1061,7 @@
           <w:sz w:val="22"/>
           <w:szCs w:val="22"/>
         </w:rPr>
-        <w:t xml:space="preserve">When you open the </w:t>
-      </w:r>
-      <w:proofErr w:type="gramStart"/>
-      <w:r>
-        <w:rPr>
-          <w:rFonts w:ascii="Segoe UI" w:eastAsia="Segoe UI" w:hAnsi="Segoe UI" w:cs="Segoe UI"/>
-          <w:color w:val="333333"/>
-          <w:sz w:val="22"/>
-          <w:szCs w:val="22"/>
-        </w:rPr>
-        <w:t>agent</w:t>
-      </w:r>
-      <w:proofErr w:type="gramEnd"/>
-      <w:r>
-        <w:rPr>
-          <w:rFonts w:ascii="Segoe UI" w:eastAsia="Segoe UI" w:hAnsi="Segoe UI" w:cs="Segoe UI"/>
-          <w:color w:val="333333"/>
-          <w:sz w:val="22"/>
-          <w:szCs w:val="22"/>
-        </w:rPr>
-        <w:t xml:space="preserve"> you’ll see clickable prompt buttons at the bottom of the chat. Just click one to get started — no typing needed:</w:t>
+        <w:t>When you open the agent you’ll see clickable prompt buttons at the bottom of the chat. Just click one to get started — no typing needed:</w:t>
       </w:r>
     </w:p>
     <w:tbl>
@@ -3130,23 +3090,7 @@
                 <w:rFonts w:ascii="Segoe UI" w:eastAsia="Segoe UI" w:hAnsi="Segoe UI" w:cs="Segoe UI"/>
                 <w:color w:val="333333"/>
               </w:rPr>
-              <w:t xml:space="preserve">Choose Overwrite to update the existing </w:t>
-            </w:r>
-            <w:proofErr w:type="gramStart"/>
-            <w:r>
-              <w:rPr>
-                <w:rFonts w:ascii="Segoe UI" w:eastAsia="Segoe UI" w:hAnsi="Segoe UI" w:cs="Segoe UI"/>
-                <w:color w:val="333333"/>
-              </w:rPr>
-              <w:t>solution, or</w:t>
-            </w:r>
-            <w:proofErr w:type="gramEnd"/>
-            <w:r>
-              <w:rPr>
-                <w:rFonts w:ascii="Segoe UI" w:eastAsia="Segoe UI" w:hAnsi="Segoe UI" w:cs="Segoe UI"/>
-                <w:color w:val="333333"/>
-              </w:rPr>
-              <w:t xml:space="preserve"> delete the old one first.</w:t>
+              <w:t>Choose Overwrite to update the existing solution, or delete the old one first.</w:t>
             </w:r>
           </w:p>
         </w:tc>
@@ -3160,15 +3104,2130 @@
     <w:p>
       <w:pPr>
         <w:spacing w:before="360" w:after="180"/>
-      </w:pPr>
-      <w:r>
         <w:rPr>
           <w:rFonts w:ascii="Segoe UI Light" w:eastAsia="Segoe UI Light" w:hAnsi="Segoe UI Light" w:cs="Segoe UI Light"/>
           <w:color w:val="0078D4"/>
           <w:sz w:val="52"/>
           <w:szCs w:val="52"/>
         </w:rPr>
-        <w:lastRenderedPageBreak/>
+      </w:pPr>
+    </w:p>
+    <w:p>
+      <w:pPr>
+        <w:spacing w:before="280" w:after="140"/>
+      </w:pPr>
+      <w:r>
+        <w:rPr>
+          <w:rFonts w:ascii="Segoe UI Semibold" w:eastAsia="Segoe UI Light" w:hAnsi="Segoe UI Semibold" w:cs="Segoe UI Semibold"/>
+          <w:color w:val="038387"/>
+          <w:sz w:val="36"/>
+          <w:szCs w:val="52"/>
+        </w:rPr>
+        <w:t>Configure Dataverse Table Permissions for Agent Users</w:t>
+      </w:r>
+    </w:p>
+    <w:p>
+      <w:pPr>
+        <w:spacing w:before="280" w:after="80"/>
+      </w:pPr>
+      <w:r>
+        <w:rPr>
+          <w:rFonts w:ascii="Segoe UI" w:eastAsia="Segoe UI Light" w:hAnsi="Segoe UI" w:cs="Segoe UI"/>
+          <w:color w:val="333333"/>
+          <w:sz w:val="22"/>
+          <w:szCs w:val="52"/>
+        </w:rPr>
+        <w:t>The Request Tracker Agent uses Power Automate cloud flows that run in invoker mode — meaning each user's own credentials are used when reading or writing data. For users to successfully create, update, or search requests through the agent, they must have the correct Dataverse security role assigned to their account.</w:t>
+      </w:r>
+    </w:p>
+    <w:p>
+      <w:pPr>
+        <w:spacing w:before="280" w:after="80"/>
+      </w:pPr>
+      <w:r>
+        <w:rPr>
+          <w:rFonts w:ascii="Segoe UI" w:eastAsia="Segoe UI Light" w:hAnsi="Segoe UI" w:cs="Segoe UI"/>
+          <w:color w:val="333333"/>
+          <w:sz w:val="22"/>
+          <w:szCs w:val="52"/>
+        </w:rPr>
+        <w:t>By default, only users with the System Administrator or System Customizer roles can access custom Dataverse tables. You need to either create a dedicated security role or modify an existing one to grant your team the right permissions on the Request Tracker table.</w:t>
+      </w:r>
+    </w:p>
+    <w:p>
+      <w:pPr>
+        <w:spacing w:before="200" w:after="100"/>
+        <w:rPr>
+          <w:rFonts w:ascii="Segoe UI Semibold" w:eastAsia="Segoe UI Light" w:hAnsi="Segoe UI Semibold" w:cs="Segoe UI Semibold"/>
+          <w:color w:val="8764B8"/>
+          <w:sz w:val="28"/>
+          <w:szCs w:val="52"/>
+        </w:rPr>
+      </w:pPr>
+      <w:r>
+        <w:rPr>
+          <w:rFonts w:ascii="Segoe UI Semibold" w:eastAsia="Segoe UI Light" w:hAnsi="Segoe UI Semibold" w:cs="Segoe UI Semibold"/>
+          <w:color w:val="8764B8"/>
+          <w:sz w:val="28"/>
+          <w:szCs w:val="52"/>
+        </w:rPr>
+        <w:t>What Permissions Are Needed</w:t>
+      </w:r>
+    </w:p>
+    <w:p>
+      <w:pPr>
+        <w:spacing w:before="200" w:after="80"/>
+      </w:pPr>
+      <w:r>
+        <w:rPr>
+          <w:rFonts w:ascii="Segoe UI" w:eastAsia="Segoe UI Light" w:hAnsi="Segoe UI" w:cs="Segoe UI"/>
+          <w:color w:val="333333"/>
+          <w:sz w:val="22"/>
+          <w:szCs w:val="52"/>
+        </w:rPr>
+        <w:t>Each user who interacts with the agent needs these permissions on the Request Tracker table:</w:t>
+      </w:r>
+    </w:p>
+    <w:tbl>
+      <w:tblPr>
+        <w:tblW w:w="5000" w:type="pct"/>
+        <w:tblLayout w:type="fixed"/>
+        <w:tblLook w:val="0000" w:firstRow="0" w:lastRow="0" w:firstColumn="0" w:lastColumn="0" w:noHBand="0" w:noVBand="0"/>
+      </w:tblPr>
+      <w:tblGrid>
+        <w:gridCol w:w="3008"/>
+        <w:gridCol w:w="3009"/>
+        <w:gridCol w:w="3009"/>
+      </w:tblGrid>
+      <w:tr>
+        <w:tblPrEx>
+          <w:tblCellMar>
+            <w:top w:w="0" w:type="dxa"/>
+            <w:bottom w:w="0" w:type="dxa"/>
+          </w:tblCellMar>
+        </w:tblPrEx>
+        <w:tc>
+          <w:tcPr>
+            <w:tcW w:w="3008" w:type="dxa"/>
+            <w:shd w:val="clear" w:color="auto" w:fill="0078D4"/>
+          </w:tcPr>
+          <w:p>
+            <w:pPr>
+              <w:spacing w:before="200" w:after="80"/>
+              <w:rPr>
+                <w:rFonts w:ascii="Segoe UI Semibold" w:eastAsia="Segoe UI Light" w:hAnsi="Segoe UI Semibold" w:cs="Segoe UI Semibold"/>
+                <w:b/>
+                <w:color w:val="FFFFFF"/>
+                <w:szCs w:val="52"/>
+              </w:rPr>
+            </w:pPr>
+            <w:r>
+              <w:rPr>
+                <w:rFonts w:ascii="Segoe UI Semibold" w:eastAsia="Segoe UI Light" w:hAnsi="Segoe UI Semibold" w:cs="Segoe UI Semibold"/>
+                <w:b/>
+                <w:color w:val="FFFFFF"/>
+                <w:szCs w:val="52"/>
+              </w:rPr>
+              <w:t>Permission</w:t>
+            </w:r>
+          </w:p>
+        </w:tc>
+        <w:tc>
+          <w:tcPr>
+            <w:tcW w:w="3009" w:type="dxa"/>
+            <w:shd w:val="clear" w:color="auto" w:fill="0078D4"/>
+          </w:tcPr>
+          <w:p>
+            <w:pPr>
+              <w:spacing w:before="200" w:after="80"/>
+              <w:rPr>
+                <w:rFonts w:ascii="Segoe UI Semibold" w:eastAsia="Segoe UI Light" w:hAnsi="Segoe UI Semibold" w:cs="Segoe UI Semibold"/>
+                <w:b/>
+                <w:color w:val="FFFFFF"/>
+                <w:szCs w:val="52"/>
+              </w:rPr>
+            </w:pPr>
+            <w:r>
+              <w:rPr>
+                <w:rFonts w:ascii="Segoe UI Semibold" w:eastAsia="Segoe UI Light" w:hAnsi="Segoe UI Semibold" w:cs="Segoe UI Semibold"/>
+                <w:b/>
+                <w:color w:val="FFFFFF"/>
+                <w:szCs w:val="52"/>
+              </w:rPr>
+              <w:t>Level</w:t>
+            </w:r>
+          </w:p>
+        </w:tc>
+        <w:tc>
+          <w:tcPr>
+            <w:tcW w:w="3009" w:type="dxa"/>
+            <w:shd w:val="clear" w:color="auto" w:fill="0078D4"/>
+          </w:tcPr>
+          <w:p>
+            <w:pPr>
+              <w:spacing w:before="200" w:after="80"/>
+              <w:rPr>
+                <w:rFonts w:ascii="Segoe UI Semibold" w:eastAsia="Segoe UI Light" w:hAnsi="Segoe UI Semibold" w:cs="Segoe UI Semibold"/>
+                <w:b/>
+                <w:color w:val="FFFFFF"/>
+                <w:szCs w:val="52"/>
+              </w:rPr>
+            </w:pPr>
+            <w:r>
+              <w:rPr>
+                <w:rFonts w:ascii="Segoe UI Semibold" w:eastAsia="Segoe UI Light" w:hAnsi="Segoe UI Semibold" w:cs="Segoe UI Semibold"/>
+                <w:b/>
+                <w:color w:val="FFFFFF"/>
+                <w:szCs w:val="52"/>
+              </w:rPr>
+              <w:t>Why It's Needed</w:t>
+            </w:r>
+          </w:p>
+        </w:tc>
+      </w:tr>
+      <w:tr>
+        <w:tblPrEx>
+          <w:tblCellMar>
+            <w:top w:w="0" w:type="dxa"/>
+            <w:bottom w:w="0" w:type="dxa"/>
+          </w:tblCellMar>
+        </w:tblPrEx>
+        <w:tc>
+          <w:tcPr>
+            <w:tcW w:w="3008" w:type="dxa"/>
+            <w:shd w:val="clear" w:color="auto" w:fill="F5F5F5"/>
+          </w:tcPr>
+          <w:p>
+            <w:pPr>
+              <w:spacing w:before="200" w:after="80"/>
+              <w:rPr>
+                <w:rFonts w:ascii="Segoe UI" w:eastAsia="Segoe UI Light" w:hAnsi="Segoe UI" w:cs="Segoe UI"/>
+                <w:color w:val="333333"/>
+                <w:szCs w:val="52"/>
+              </w:rPr>
+            </w:pPr>
+            <w:r>
+              <w:rPr>
+                <w:rFonts w:ascii="Segoe UI" w:eastAsia="Segoe UI Light" w:hAnsi="Segoe UI" w:cs="Segoe UI"/>
+                <w:color w:val="333333"/>
+                <w:szCs w:val="52"/>
+              </w:rPr>
+              <w:t>Create</w:t>
+            </w:r>
+          </w:p>
+        </w:tc>
+        <w:tc>
+          <w:tcPr>
+            <w:tcW w:w="3009" w:type="dxa"/>
+            <w:shd w:val="clear" w:color="auto" w:fill="F5F5F5"/>
+          </w:tcPr>
+          <w:p>
+            <w:pPr>
+              <w:spacing w:before="200" w:after="80"/>
+              <w:rPr>
+                <w:rFonts w:ascii="Segoe UI" w:eastAsia="Segoe UI Light" w:hAnsi="Segoe UI" w:cs="Segoe UI"/>
+                <w:color w:val="333333"/>
+                <w:szCs w:val="52"/>
+              </w:rPr>
+            </w:pPr>
+            <w:r>
+              <w:rPr>
+                <w:rFonts w:ascii="Segoe UI" w:eastAsia="Segoe UI Light" w:hAnsi="Segoe UI" w:cs="Segoe UI"/>
+                <w:color w:val="333333"/>
+                <w:szCs w:val="52"/>
+              </w:rPr>
+              <w:t>Organization</w:t>
+            </w:r>
+          </w:p>
+        </w:tc>
+        <w:tc>
+          <w:tcPr>
+            <w:tcW w:w="3009" w:type="dxa"/>
+            <w:shd w:val="clear" w:color="auto" w:fill="F5F5F5"/>
+          </w:tcPr>
+          <w:p>
+            <w:pPr>
+              <w:spacing w:before="200" w:after="80"/>
+              <w:rPr>
+                <w:rFonts w:ascii="Segoe UI" w:eastAsia="Segoe UI Light" w:hAnsi="Segoe UI" w:cs="Segoe UI"/>
+                <w:color w:val="333333"/>
+                <w:szCs w:val="52"/>
+              </w:rPr>
+            </w:pPr>
+            <w:r>
+              <w:rPr>
+                <w:rFonts w:ascii="Segoe UI" w:eastAsia="Segoe UI Light" w:hAnsi="Segoe UI" w:cs="Segoe UI"/>
+                <w:color w:val="333333"/>
+                <w:szCs w:val="52"/>
+              </w:rPr>
+              <w:t>Allows creating new request records via the agent</w:t>
+            </w:r>
+          </w:p>
+        </w:tc>
+      </w:tr>
+      <w:tr>
+        <w:tblPrEx>
+          <w:tblCellMar>
+            <w:top w:w="0" w:type="dxa"/>
+            <w:bottom w:w="0" w:type="dxa"/>
+          </w:tblCellMar>
+        </w:tblPrEx>
+        <w:tc>
+          <w:tcPr>
+            <w:tcW w:w="3008" w:type="dxa"/>
+            <w:shd w:val="clear" w:color="auto" w:fill="FFFFFF"/>
+          </w:tcPr>
+          <w:p>
+            <w:pPr>
+              <w:spacing w:before="200" w:after="80"/>
+              <w:rPr>
+                <w:rFonts w:ascii="Segoe UI" w:eastAsia="Segoe UI Light" w:hAnsi="Segoe UI" w:cs="Segoe UI"/>
+                <w:color w:val="333333"/>
+                <w:szCs w:val="52"/>
+              </w:rPr>
+            </w:pPr>
+            <w:r>
+              <w:rPr>
+                <w:rFonts w:ascii="Segoe UI" w:eastAsia="Segoe UI Light" w:hAnsi="Segoe UI" w:cs="Segoe UI"/>
+                <w:color w:val="333333"/>
+                <w:szCs w:val="52"/>
+              </w:rPr>
+              <w:t>Read</w:t>
+            </w:r>
+          </w:p>
+        </w:tc>
+        <w:tc>
+          <w:tcPr>
+            <w:tcW w:w="3009" w:type="dxa"/>
+            <w:shd w:val="clear" w:color="auto" w:fill="FFFFFF"/>
+          </w:tcPr>
+          <w:p>
+            <w:pPr>
+              <w:spacing w:before="200" w:after="80"/>
+              <w:rPr>
+                <w:rFonts w:ascii="Segoe UI" w:eastAsia="Segoe UI Light" w:hAnsi="Segoe UI" w:cs="Segoe UI"/>
+                <w:color w:val="333333"/>
+                <w:szCs w:val="52"/>
+              </w:rPr>
+            </w:pPr>
+            <w:r>
+              <w:rPr>
+                <w:rFonts w:ascii="Segoe UI" w:eastAsia="Segoe UI Light" w:hAnsi="Segoe UI" w:cs="Segoe UI"/>
+                <w:color w:val="333333"/>
+                <w:szCs w:val="52"/>
+              </w:rPr>
+              <w:t>Organization</w:t>
+            </w:r>
+          </w:p>
+        </w:tc>
+        <w:tc>
+          <w:tcPr>
+            <w:tcW w:w="3009" w:type="dxa"/>
+            <w:shd w:val="clear" w:color="auto" w:fill="FFFFFF"/>
+          </w:tcPr>
+          <w:p>
+            <w:pPr>
+              <w:spacing w:before="200" w:after="80"/>
+              <w:rPr>
+                <w:rFonts w:ascii="Segoe UI" w:eastAsia="Segoe UI Light" w:hAnsi="Segoe UI" w:cs="Segoe UI"/>
+                <w:color w:val="333333"/>
+                <w:szCs w:val="52"/>
+              </w:rPr>
+            </w:pPr>
+            <w:r>
+              <w:rPr>
+                <w:rFonts w:ascii="Segoe UI" w:eastAsia="Segoe UI Light" w:hAnsi="Segoe UI" w:cs="Segoe UI"/>
+                <w:color w:val="333333"/>
+                <w:szCs w:val="52"/>
+              </w:rPr>
+              <w:t>Allows searching, querying, and viewing all request records</w:t>
+            </w:r>
+          </w:p>
+        </w:tc>
+      </w:tr>
+      <w:tr>
+        <w:tblPrEx>
+          <w:tblCellMar>
+            <w:top w:w="0" w:type="dxa"/>
+            <w:bottom w:w="0" w:type="dxa"/>
+          </w:tblCellMar>
+        </w:tblPrEx>
+        <w:tc>
+          <w:tcPr>
+            <w:tcW w:w="3008" w:type="dxa"/>
+            <w:shd w:val="clear" w:color="auto" w:fill="F5F5F5"/>
+          </w:tcPr>
+          <w:p>
+            <w:pPr>
+              <w:spacing w:before="200" w:after="80"/>
+              <w:rPr>
+                <w:rFonts w:ascii="Segoe UI" w:eastAsia="Segoe UI Light" w:hAnsi="Segoe UI" w:cs="Segoe UI"/>
+                <w:color w:val="333333"/>
+                <w:szCs w:val="52"/>
+              </w:rPr>
+            </w:pPr>
+            <w:r>
+              <w:rPr>
+                <w:rFonts w:ascii="Segoe UI" w:eastAsia="Segoe UI Light" w:hAnsi="Segoe UI" w:cs="Segoe UI"/>
+                <w:color w:val="333333"/>
+                <w:szCs w:val="52"/>
+              </w:rPr>
+              <w:t>Write</w:t>
+            </w:r>
+          </w:p>
+        </w:tc>
+        <w:tc>
+          <w:tcPr>
+            <w:tcW w:w="3009" w:type="dxa"/>
+            <w:shd w:val="clear" w:color="auto" w:fill="F5F5F5"/>
+          </w:tcPr>
+          <w:p>
+            <w:pPr>
+              <w:spacing w:before="200" w:after="80"/>
+              <w:rPr>
+                <w:rFonts w:ascii="Segoe UI" w:eastAsia="Segoe UI Light" w:hAnsi="Segoe UI" w:cs="Segoe UI"/>
+                <w:color w:val="333333"/>
+                <w:szCs w:val="52"/>
+              </w:rPr>
+            </w:pPr>
+            <w:r>
+              <w:rPr>
+                <w:rFonts w:ascii="Segoe UI" w:eastAsia="Segoe UI Light" w:hAnsi="Segoe UI" w:cs="Segoe UI"/>
+                <w:color w:val="333333"/>
+                <w:szCs w:val="52"/>
+              </w:rPr>
+              <w:t>Organization</w:t>
+            </w:r>
+          </w:p>
+        </w:tc>
+        <w:tc>
+          <w:tcPr>
+            <w:tcW w:w="3009" w:type="dxa"/>
+            <w:shd w:val="clear" w:color="auto" w:fill="F5F5F5"/>
+          </w:tcPr>
+          <w:p>
+            <w:pPr>
+              <w:spacing w:before="200" w:after="80"/>
+              <w:rPr>
+                <w:rFonts w:ascii="Segoe UI" w:eastAsia="Segoe UI Light" w:hAnsi="Segoe UI" w:cs="Segoe UI"/>
+                <w:color w:val="333333"/>
+                <w:szCs w:val="52"/>
+              </w:rPr>
+            </w:pPr>
+            <w:r>
+              <w:rPr>
+                <w:rFonts w:ascii="Segoe UI" w:eastAsia="Segoe UI Light" w:hAnsi="Segoe UI" w:cs="Segoe UI"/>
+                <w:color w:val="333333"/>
+                <w:szCs w:val="52"/>
+              </w:rPr>
+              <w:t>Allows updating existing request records</w:t>
+            </w:r>
+          </w:p>
+        </w:tc>
+      </w:tr>
+      <w:tr>
+        <w:tblPrEx>
+          <w:tblCellMar>
+            <w:top w:w="0" w:type="dxa"/>
+            <w:bottom w:w="0" w:type="dxa"/>
+          </w:tblCellMar>
+        </w:tblPrEx>
+        <w:tc>
+          <w:tcPr>
+            <w:tcW w:w="3008" w:type="dxa"/>
+            <w:shd w:val="clear" w:color="auto" w:fill="FFFFFF"/>
+          </w:tcPr>
+          <w:p>
+            <w:pPr>
+              <w:spacing w:before="200" w:after="80"/>
+              <w:rPr>
+                <w:rFonts w:ascii="Segoe UI" w:eastAsia="Segoe UI Light" w:hAnsi="Segoe UI" w:cs="Segoe UI"/>
+                <w:color w:val="333333"/>
+                <w:szCs w:val="52"/>
+              </w:rPr>
+            </w:pPr>
+            <w:r>
+              <w:rPr>
+                <w:rFonts w:ascii="Segoe UI" w:eastAsia="Segoe UI Light" w:hAnsi="Segoe UI" w:cs="Segoe UI"/>
+                <w:color w:val="333333"/>
+                <w:szCs w:val="52"/>
+              </w:rPr>
+              <w:t>Delete</w:t>
+            </w:r>
+          </w:p>
+        </w:tc>
+        <w:tc>
+          <w:tcPr>
+            <w:tcW w:w="3009" w:type="dxa"/>
+            <w:shd w:val="clear" w:color="auto" w:fill="FFFFFF"/>
+          </w:tcPr>
+          <w:p>
+            <w:pPr>
+              <w:spacing w:before="200" w:after="80"/>
+              <w:rPr>
+                <w:rFonts w:ascii="Segoe UI" w:eastAsia="Segoe UI Light" w:hAnsi="Segoe UI" w:cs="Segoe UI"/>
+                <w:color w:val="333333"/>
+                <w:szCs w:val="52"/>
+              </w:rPr>
+            </w:pPr>
+            <w:r>
+              <w:rPr>
+                <w:rFonts w:ascii="Segoe UI" w:eastAsia="Segoe UI Light" w:hAnsi="Segoe UI" w:cs="Segoe UI"/>
+                <w:color w:val="333333"/>
+                <w:szCs w:val="52"/>
+              </w:rPr>
+              <w:t>Organization</w:t>
+            </w:r>
+          </w:p>
+        </w:tc>
+        <w:tc>
+          <w:tcPr>
+            <w:tcW w:w="3009" w:type="dxa"/>
+            <w:shd w:val="clear" w:color="auto" w:fill="FFFFFF"/>
+          </w:tcPr>
+          <w:p>
+            <w:pPr>
+              <w:spacing w:before="200" w:after="80"/>
+              <w:rPr>
+                <w:rFonts w:ascii="Segoe UI" w:eastAsia="Segoe UI Light" w:hAnsi="Segoe UI" w:cs="Segoe UI"/>
+                <w:color w:val="333333"/>
+                <w:szCs w:val="52"/>
+              </w:rPr>
+            </w:pPr>
+            <w:r>
+              <w:rPr>
+                <w:rFonts w:ascii="Segoe UI" w:eastAsia="Segoe UI Light" w:hAnsi="Segoe UI" w:cs="Segoe UI"/>
+                <w:color w:val="333333"/>
+                <w:szCs w:val="52"/>
+              </w:rPr>
+              <w:t>Allows removing request records (admin cleanup)</w:t>
+            </w:r>
+          </w:p>
+        </w:tc>
+      </w:tr>
+      <w:tr>
+        <w:tblPrEx>
+          <w:tblCellMar>
+            <w:top w:w="0" w:type="dxa"/>
+            <w:bottom w:w="0" w:type="dxa"/>
+          </w:tblCellMar>
+        </w:tblPrEx>
+        <w:tc>
+          <w:tcPr>
+            <w:tcW w:w="3008" w:type="dxa"/>
+            <w:shd w:val="clear" w:color="auto" w:fill="F5F5F5"/>
+          </w:tcPr>
+          <w:p>
+            <w:pPr>
+              <w:spacing w:before="200" w:after="80"/>
+              <w:rPr>
+                <w:rFonts w:ascii="Segoe UI" w:eastAsia="Segoe UI Light" w:hAnsi="Segoe UI" w:cs="Segoe UI"/>
+                <w:color w:val="333333"/>
+                <w:szCs w:val="52"/>
+              </w:rPr>
+            </w:pPr>
+            <w:r>
+              <w:rPr>
+                <w:rFonts w:ascii="Segoe UI" w:eastAsia="Segoe UI Light" w:hAnsi="Segoe UI" w:cs="Segoe UI"/>
+                <w:color w:val="333333"/>
+                <w:szCs w:val="52"/>
+              </w:rPr>
+              <w:t>Append</w:t>
+            </w:r>
+          </w:p>
+        </w:tc>
+        <w:tc>
+          <w:tcPr>
+            <w:tcW w:w="3009" w:type="dxa"/>
+            <w:shd w:val="clear" w:color="auto" w:fill="F5F5F5"/>
+          </w:tcPr>
+          <w:p>
+            <w:pPr>
+              <w:spacing w:before="200" w:after="80"/>
+              <w:rPr>
+                <w:rFonts w:ascii="Segoe UI" w:eastAsia="Segoe UI Light" w:hAnsi="Segoe UI" w:cs="Segoe UI"/>
+                <w:color w:val="333333"/>
+                <w:szCs w:val="52"/>
+              </w:rPr>
+            </w:pPr>
+            <w:r>
+              <w:rPr>
+                <w:rFonts w:ascii="Segoe UI" w:eastAsia="Segoe UI Light" w:hAnsi="Segoe UI" w:cs="Segoe UI"/>
+                <w:color w:val="333333"/>
+                <w:szCs w:val="52"/>
+              </w:rPr>
+              <w:t>Organization</w:t>
+            </w:r>
+          </w:p>
+        </w:tc>
+        <w:tc>
+          <w:tcPr>
+            <w:tcW w:w="3009" w:type="dxa"/>
+            <w:shd w:val="clear" w:color="auto" w:fill="F5F5F5"/>
+          </w:tcPr>
+          <w:p>
+            <w:pPr>
+              <w:spacing w:before="200" w:after="80"/>
+              <w:rPr>
+                <w:rFonts w:ascii="Segoe UI" w:eastAsia="Segoe UI Light" w:hAnsi="Segoe UI" w:cs="Segoe UI"/>
+                <w:color w:val="333333"/>
+                <w:szCs w:val="52"/>
+              </w:rPr>
+            </w:pPr>
+            <w:r>
+              <w:rPr>
+                <w:rFonts w:ascii="Segoe UI" w:eastAsia="Segoe UI Light" w:hAnsi="Segoe UI" w:cs="Segoe UI"/>
+                <w:color w:val="333333"/>
+                <w:szCs w:val="52"/>
+              </w:rPr>
+              <w:t>Required by Dataverse when adding related records</w:t>
+            </w:r>
+          </w:p>
+        </w:tc>
+      </w:tr>
+      <w:tr>
+        <w:tblPrEx>
+          <w:tblCellMar>
+            <w:top w:w="0" w:type="dxa"/>
+            <w:bottom w:w="0" w:type="dxa"/>
+          </w:tblCellMar>
+        </w:tblPrEx>
+        <w:tc>
+          <w:tcPr>
+            <w:tcW w:w="3008" w:type="dxa"/>
+            <w:shd w:val="clear" w:color="auto" w:fill="FFFFFF"/>
+          </w:tcPr>
+          <w:p>
+            <w:pPr>
+              <w:spacing w:before="200" w:after="80"/>
+              <w:rPr>
+                <w:rFonts w:ascii="Segoe UI" w:eastAsia="Segoe UI Light" w:hAnsi="Segoe UI" w:cs="Segoe UI"/>
+                <w:color w:val="333333"/>
+                <w:szCs w:val="52"/>
+              </w:rPr>
+            </w:pPr>
+            <w:r>
+              <w:rPr>
+                <w:rFonts w:ascii="Segoe UI" w:eastAsia="Segoe UI Light" w:hAnsi="Segoe UI" w:cs="Segoe UI"/>
+                <w:color w:val="333333"/>
+                <w:szCs w:val="52"/>
+              </w:rPr>
+              <w:t>Append To</w:t>
+            </w:r>
+          </w:p>
+        </w:tc>
+        <w:tc>
+          <w:tcPr>
+            <w:tcW w:w="3009" w:type="dxa"/>
+            <w:shd w:val="clear" w:color="auto" w:fill="FFFFFF"/>
+          </w:tcPr>
+          <w:p>
+            <w:pPr>
+              <w:spacing w:before="200" w:after="80"/>
+              <w:rPr>
+                <w:rFonts w:ascii="Segoe UI" w:eastAsia="Segoe UI Light" w:hAnsi="Segoe UI" w:cs="Segoe UI"/>
+                <w:color w:val="333333"/>
+                <w:szCs w:val="52"/>
+              </w:rPr>
+            </w:pPr>
+            <w:r>
+              <w:rPr>
+                <w:rFonts w:ascii="Segoe UI" w:eastAsia="Segoe UI Light" w:hAnsi="Segoe UI" w:cs="Segoe UI"/>
+                <w:color w:val="333333"/>
+                <w:szCs w:val="52"/>
+              </w:rPr>
+              <w:t>Organization</w:t>
+            </w:r>
+          </w:p>
+        </w:tc>
+        <w:tc>
+          <w:tcPr>
+            <w:tcW w:w="3009" w:type="dxa"/>
+            <w:shd w:val="clear" w:color="auto" w:fill="FFFFFF"/>
+          </w:tcPr>
+          <w:p>
+            <w:pPr>
+              <w:spacing w:before="200" w:after="80"/>
+              <w:rPr>
+                <w:rFonts w:ascii="Segoe UI" w:eastAsia="Segoe UI Light" w:hAnsi="Segoe UI" w:cs="Segoe UI"/>
+                <w:color w:val="333333"/>
+                <w:szCs w:val="52"/>
+              </w:rPr>
+            </w:pPr>
+            <w:r>
+              <w:rPr>
+                <w:rFonts w:ascii="Segoe UI" w:eastAsia="Segoe UI Light" w:hAnsi="Segoe UI" w:cs="Segoe UI"/>
+                <w:color w:val="333333"/>
+                <w:szCs w:val="52"/>
+              </w:rPr>
+              <w:t>Required by Dataverse when other records reference this table</w:t>
+            </w:r>
+          </w:p>
+        </w:tc>
+      </w:tr>
+    </w:tbl>
+    <w:p>
+      <w:pPr>
+        <w:spacing w:before="200" w:after="80"/>
+        <w:rPr>
+          <w:rFonts w:ascii="Segoe UI" w:eastAsia="Segoe UI Light" w:hAnsi="Segoe UI" w:cs="Segoe UI"/>
+          <w:color w:val="333333"/>
+          <w:sz w:val="22"/>
+          <w:szCs w:val="52"/>
+        </w:rPr>
+      </w:pPr>
+    </w:p>
+    <w:p>
+      <w:pPr>
+        <w:shd w:val="clear" w:color="auto" w:fill="FFF4CE"/>
+        <w:spacing w:before="120" w:after="120"/>
+        <w:ind w:left="288" w:right="288"/>
+        <w:rPr>
+          <w:rFonts w:ascii="Segoe UI" w:eastAsia="Segoe UI Light" w:hAnsi="Segoe UI" w:cs="Segoe UI"/>
+          <w:color w:val="333333"/>
+          <w:sz w:val="22"/>
+          <w:szCs w:val="52"/>
+        </w:rPr>
+      </w:pPr>
+      <w:r>
+        <w:rPr>
+          <w:rFonts w:ascii="Segoe UI Emoji" w:eastAsia="Segoe UI Light" w:hAnsi="Segoe UI Emoji" w:cs="Segoe UI Emoji"/>
+          <w:color w:val="D4A017"/>
+          <w:sz w:val="22"/>
+          <w:szCs w:val="52"/>
+        </w:rPr>
+        <w:t>⚠️</w:t>
+      </w:r>
+      <w:r>
+        <w:rPr>
+          <w:rFonts w:ascii="Segoe UI Semibold" w:eastAsia="Segoe UI Light" w:hAnsi="Segoe UI Semibold" w:cs="Segoe UI Semibold"/>
+          <w:color w:val="D4A017"/>
+          <w:sz w:val="22"/>
+          <w:szCs w:val="52"/>
+        </w:rPr>
+        <w:t xml:space="preserve"> Note: </w:t>
+      </w:r>
+      <w:r>
+        <w:rPr>
+          <w:rFonts w:ascii="Segoe UI" w:eastAsia="Segoe UI Light" w:hAnsi="Segoe UI" w:cs="Segoe UI"/>
+          <w:color w:val="333333"/>
+          <w:sz w:val="22"/>
+          <w:szCs w:val="52"/>
+        </w:rPr>
+        <w:t>Organization-level means the user can access all records in the table, not just their own. This is important because users need to see requests from other people (e.g., 'show me all high-priority requests'). If you want to restrict users to only see their own requests, set the level to User instead.</w:t>
+      </w:r>
+    </w:p>
+    <w:p>
+      <w:pPr>
+        <w:shd w:val="clear" w:color="auto" w:fill="FFF4CE"/>
+        <w:spacing w:before="200" w:after="100"/>
+        <w:ind w:left="288" w:right="288"/>
+        <w:rPr>
+          <w:rFonts w:ascii="Segoe UI Semibold" w:eastAsia="Segoe UI Light" w:hAnsi="Segoe UI Semibold" w:cs="Segoe UI Semibold"/>
+          <w:color w:val="8764B8"/>
+          <w:sz w:val="28"/>
+          <w:szCs w:val="52"/>
+        </w:rPr>
+      </w:pPr>
+      <w:r>
+        <w:rPr>
+          <w:rFonts w:ascii="Segoe UI Semibold" w:eastAsia="Segoe UI Light" w:hAnsi="Segoe UI Semibold" w:cs="Segoe UI Semibold"/>
+          <w:color w:val="8764B8"/>
+          <w:sz w:val="28"/>
+          <w:szCs w:val="52"/>
+        </w:rPr>
+        <w:t>Step-by-Step: Create a Security Role in Power Platform Admin Center</w:t>
+      </w:r>
+    </w:p>
+    <w:p>
+      <w:pPr>
+        <w:shd w:val="clear" w:color="auto" w:fill="FFF4CE"/>
+        <w:spacing w:before="200" w:after="80"/>
+        <w:ind w:left="288" w:right="288"/>
+        <w:rPr>
+          <w:rFonts w:ascii="Segoe UI" w:eastAsia="Segoe UI Light" w:hAnsi="Segoe UI" w:cs="Segoe UI"/>
+          <w:color w:val="333333"/>
+          <w:sz w:val="22"/>
+          <w:szCs w:val="52"/>
+        </w:rPr>
+      </w:pPr>
+      <w:r>
+        <w:rPr>
+          <w:rFonts w:ascii="Segoe UI Semibold" w:eastAsia="Segoe UI Light" w:hAnsi="Segoe UI Semibold" w:cs="Segoe UI Semibold"/>
+          <w:b/>
+          <w:color w:val="0078D4"/>
+          <w:sz w:val="22"/>
+          <w:szCs w:val="52"/>
+        </w:rPr>
+        <w:t xml:space="preserve">1. </w:t>
+      </w:r>
+      <w:r>
+        <w:rPr>
+          <w:rFonts w:ascii="Segoe UI" w:eastAsia="Segoe UI Light" w:hAnsi="Segoe UI" w:cs="Segoe UI"/>
+          <w:color w:val="333333"/>
+          <w:sz w:val="22"/>
+          <w:szCs w:val="52"/>
+        </w:rPr>
+        <w:t>Open your browser and go to admin.powerplatform.microsoft.com. Sign in with your Microsoft 365 admin account.</w:t>
+      </w:r>
+    </w:p>
+    <w:p>
+      <w:pPr>
+        <w:shd w:val="clear" w:color="auto" w:fill="FFF4CE"/>
+        <w:spacing w:before="200" w:after="80"/>
+        <w:ind w:left="288" w:right="288"/>
+        <w:rPr>
+          <w:rFonts w:ascii="Segoe UI" w:eastAsia="Segoe UI Light" w:hAnsi="Segoe UI" w:cs="Segoe UI"/>
+          <w:color w:val="333333"/>
+          <w:sz w:val="22"/>
+          <w:szCs w:val="52"/>
+        </w:rPr>
+      </w:pPr>
+      <w:r>
+        <w:rPr>
+          <w:rFonts w:ascii="Segoe UI Semibold" w:eastAsia="Segoe UI Light" w:hAnsi="Segoe UI Semibold" w:cs="Segoe UI Semibold"/>
+          <w:b/>
+          <w:color w:val="0078D4"/>
+          <w:sz w:val="22"/>
+          <w:szCs w:val="52"/>
+        </w:rPr>
+        <w:t xml:space="preserve">2. </w:t>
+      </w:r>
+      <w:r>
+        <w:rPr>
+          <w:rFonts w:ascii="Segoe UI" w:eastAsia="Segoe UI Light" w:hAnsi="Segoe UI" w:cs="Segoe UI"/>
+          <w:color w:val="333333"/>
+          <w:sz w:val="22"/>
+          <w:szCs w:val="52"/>
+        </w:rPr>
+        <w:t>In the left navigation pane, click Environments. Find and click on the environment where you imported the Request Tracker solution.</w:t>
+      </w:r>
+    </w:p>
+    <w:p>
+      <w:pPr>
+        <w:shd w:val="clear" w:color="auto" w:fill="FFF4CE"/>
+        <w:spacing w:before="200" w:after="80"/>
+        <w:ind w:left="288" w:right="288"/>
+        <w:rPr>
+          <w:rFonts w:ascii="Segoe UI" w:eastAsia="Segoe UI Light" w:hAnsi="Segoe UI" w:cs="Segoe UI"/>
+          <w:color w:val="333333"/>
+          <w:sz w:val="22"/>
+          <w:szCs w:val="52"/>
+        </w:rPr>
+      </w:pPr>
+      <w:r>
+        <w:rPr>
+          <w:rFonts w:ascii="Segoe UI Semibold" w:eastAsia="Segoe UI Light" w:hAnsi="Segoe UI Semibold" w:cs="Segoe UI Semibold"/>
+          <w:b/>
+          <w:color w:val="0078D4"/>
+          <w:sz w:val="22"/>
+          <w:szCs w:val="52"/>
+        </w:rPr>
+        <w:t xml:space="preserve">3. </w:t>
+      </w:r>
+      <w:r>
+        <w:rPr>
+          <w:rFonts w:ascii="Segoe UI" w:eastAsia="Segoe UI Light" w:hAnsi="Segoe UI" w:cs="Segoe UI"/>
+          <w:color w:val="333333"/>
+          <w:sz w:val="22"/>
+          <w:szCs w:val="52"/>
+        </w:rPr>
+        <w:t>In the environment details page, click Settings in the top command bar.</w:t>
+      </w:r>
+    </w:p>
+    <w:p>
+      <w:pPr>
+        <w:shd w:val="clear" w:color="auto" w:fill="FFF4CE"/>
+        <w:spacing w:before="200" w:after="80"/>
+        <w:ind w:left="288" w:right="288"/>
+        <w:rPr>
+          <w:rFonts w:ascii="Segoe UI" w:eastAsia="Segoe UI Light" w:hAnsi="Segoe UI" w:cs="Segoe UI"/>
+          <w:color w:val="333333"/>
+          <w:sz w:val="22"/>
+          <w:szCs w:val="52"/>
+        </w:rPr>
+      </w:pPr>
+      <w:r>
+        <w:rPr>
+          <w:rFonts w:ascii="Segoe UI Semibold" w:eastAsia="Segoe UI Light" w:hAnsi="Segoe UI Semibold" w:cs="Segoe UI Semibold"/>
+          <w:b/>
+          <w:color w:val="0078D4"/>
+          <w:sz w:val="22"/>
+          <w:szCs w:val="52"/>
+        </w:rPr>
+        <w:t xml:space="preserve">4. </w:t>
+      </w:r>
+      <w:r>
+        <w:rPr>
+          <w:rFonts w:ascii="Segoe UI" w:eastAsia="Segoe UI Light" w:hAnsi="Segoe UI" w:cs="Segoe UI"/>
+          <w:color w:val="333333"/>
+          <w:sz w:val="22"/>
+          <w:szCs w:val="52"/>
+        </w:rPr>
+        <w:t>In the Settings page, expand the Users + permissions section in the left panel. Click Security roles.</w:t>
+      </w:r>
+    </w:p>
+    <w:p>
+      <w:pPr>
+        <w:shd w:val="clear" w:color="auto" w:fill="FFF4CE"/>
+        <w:spacing w:before="200" w:after="80"/>
+        <w:ind w:left="288" w:right="288"/>
+        <w:rPr>
+          <w:rFonts w:ascii="Segoe UI" w:eastAsia="Segoe UI Light" w:hAnsi="Segoe UI" w:cs="Segoe UI"/>
+          <w:color w:val="333333"/>
+          <w:sz w:val="22"/>
+          <w:szCs w:val="52"/>
+        </w:rPr>
+      </w:pPr>
+      <w:r>
+        <w:rPr>
+          <w:rFonts w:ascii="Segoe UI Semibold" w:eastAsia="Segoe UI Light" w:hAnsi="Segoe UI Semibold" w:cs="Segoe UI Semibold"/>
+          <w:b/>
+          <w:color w:val="0078D4"/>
+          <w:sz w:val="22"/>
+          <w:szCs w:val="52"/>
+        </w:rPr>
+        <w:t xml:space="preserve">5. </w:t>
+      </w:r>
+      <w:r>
+        <w:rPr>
+          <w:rFonts w:ascii="Segoe UI" w:eastAsia="Segoe UI Light" w:hAnsi="Segoe UI" w:cs="Segoe UI"/>
+          <w:color w:val="333333"/>
+          <w:sz w:val="22"/>
+          <w:szCs w:val="52"/>
+        </w:rPr>
+        <w:t>Click + New role in the top command bar to create a new security role.</w:t>
+      </w:r>
+    </w:p>
+    <w:p>
+      <w:pPr>
+        <w:shd w:val="clear" w:color="auto" w:fill="FFF4CE"/>
+        <w:spacing w:before="200" w:after="80"/>
+        <w:ind w:left="288" w:right="288"/>
+        <w:rPr>
+          <w:rFonts w:ascii="Segoe UI" w:eastAsia="Segoe UI Light" w:hAnsi="Segoe UI" w:cs="Segoe UI"/>
+          <w:color w:val="333333"/>
+          <w:sz w:val="22"/>
+          <w:szCs w:val="52"/>
+        </w:rPr>
+      </w:pPr>
+      <w:r>
+        <w:rPr>
+          <w:rFonts w:ascii="Segoe UI Semibold" w:eastAsia="Segoe UI Light" w:hAnsi="Segoe UI Semibold" w:cs="Segoe UI Semibold"/>
+          <w:b/>
+          <w:color w:val="0078D4"/>
+          <w:sz w:val="22"/>
+          <w:szCs w:val="52"/>
+        </w:rPr>
+        <w:t xml:space="preserve">6. </w:t>
+      </w:r>
+      <w:r>
+        <w:rPr>
+          <w:rFonts w:ascii="Segoe UI" w:eastAsia="Segoe UI Light" w:hAnsi="Segoe UI" w:cs="Segoe UI"/>
+          <w:color w:val="333333"/>
+          <w:sz w:val="22"/>
+          <w:szCs w:val="52"/>
+        </w:rPr>
+        <w:t>Fill in the role details:</w:t>
+      </w:r>
+    </w:p>
+    <w:p>
+      <w:pPr>
+        <w:shd w:val="clear" w:color="auto" w:fill="FFF4CE"/>
+        <w:spacing w:before="200" w:after="40"/>
+        <w:ind w:left="576" w:right="288"/>
+        <w:rPr>
+          <w:rFonts w:ascii="Segoe UI" w:eastAsia="Segoe UI Light" w:hAnsi="Segoe UI" w:cs="Segoe UI"/>
+          <w:color w:val="333333"/>
+          <w:sz w:val="22"/>
+          <w:szCs w:val="52"/>
+        </w:rPr>
+      </w:pPr>
+      <w:r>
+        <w:rPr>
+          <w:rFonts w:ascii="Segoe UI" w:eastAsia="Segoe UI Light" w:hAnsi="Segoe UI" w:cs="Segoe UI"/>
+          <w:color w:val="333333"/>
+          <w:sz w:val="22"/>
+          <w:szCs w:val="52"/>
+        </w:rPr>
+        <w:t>• Role Name: Request Tracker User</w:t>
+      </w:r>
+    </w:p>
+    <w:p>
+      <w:pPr>
+        <w:shd w:val="clear" w:color="auto" w:fill="FFF4CE"/>
+        <w:spacing w:before="200" w:after="40"/>
+        <w:ind w:left="576" w:right="288"/>
+        <w:rPr>
+          <w:rFonts w:ascii="Segoe UI" w:eastAsia="Segoe UI Light" w:hAnsi="Segoe UI" w:cs="Segoe UI"/>
+          <w:color w:val="333333"/>
+          <w:sz w:val="22"/>
+          <w:szCs w:val="52"/>
+        </w:rPr>
+      </w:pPr>
+      <w:r>
+        <w:rPr>
+          <w:rFonts w:ascii="Segoe UI" w:eastAsia="Segoe UI Light" w:hAnsi="Segoe UI" w:cs="Segoe UI"/>
+          <w:color w:val="333333"/>
+          <w:sz w:val="22"/>
+          <w:szCs w:val="52"/>
+        </w:rPr>
+        <w:t>• Business Unit: (leave as default — your root business unit)</w:t>
+      </w:r>
+    </w:p>
+    <w:p>
+      <w:pPr>
+        <w:shd w:val="clear" w:color="auto" w:fill="FFF4CE"/>
+        <w:spacing w:before="200" w:after="40"/>
+        <w:ind w:left="576" w:right="288"/>
+        <w:rPr>
+          <w:rFonts w:ascii="Segoe UI" w:eastAsia="Segoe UI Light" w:hAnsi="Segoe UI" w:cs="Segoe UI"/>
+          <w:color w:val="333333"/>
+          <w:sz w:val="22"/>
+          <w:szCs w:val="52"/>
+        </w:rPr>
+      </w:pPr>
+      <w:r>
+        <w:rPr>
+          <w:rFonts w:ascii="Segoe UI" w:eastAsia="Segoe UI Light" w:hAnsi="Segoe UI" w:cs="Segoe UI"/>
+          <w:color w:val="333333"/>
+          <w:sz w:val="22"/>
+          <w:szCs w:val="52"/>
+        </w:rPr>
+        <w:t>• Description: Grants permissions to create, read, update, and delete records in the Request Tracker Dataverse table via the agent.</w:t>
+      </w:r>
+    </w:p>
+    <w:p>
+      <w:pPr>
+        <w:shd w:val="clear" w:color="auto" w:fill="FFF4CE"/>
+        <w:spacing w:before="200" w:after="40"/>
+        <w:ind w:left="576" w:right="288"/>
+        <w:rPr>
+          <w:rFonts w:ascii="Segoe UI" w:eastAsia="Segoe UI Light" w:hAnsi="Segoe UI" w:cs="Segoe UI"/>
+          <w:color w:val="333333"/>
+          <w:sz w:val="22"/>
+          <w:szCs w:val="52"/>
+        </w:rPr>
+      </w:pPr>
+      <w:r>
+        <w:rPr>
+          <w:rFonts w:ascii="Segoe UI" w:eastAsia="Segoe UI Light" w:hAnsi="Segoe UI" w:cs="Segoe UI"/>
+          <w:color w:val="333333"/>
+          <w:sz w:val="22"/>
+          <w:szCs w:val="52"/>
+        </w:rPr>
+        <w:t>• Member's privilege inheritance: Direct User (Basic) access level and Team privileges (the default)</w:t>
+      </w:r>
+    </w:p>
+    <w:p>
+      <w:pPr>
+        <w:shd w:val="clear" w:color="auto" w:fill="FFF4CE"/>
+        <w:spacing w:before="200" w:after="80"/>
+        <w:ind w:left="288" w:right="288"/>
+        <w:rPr>
+          <w:rFonts w:ascii="Segoe UI" w:eastAsia="Segoe UI Light" w:hAnsi="Segoe UI" w:cs="Segoe UI"/>
+          <w:color w:val="333333"/>
+          <w:sz w:val="22"/>
+          <w:szCs w:val="52"/>
+        </w:rPr>
+      </w:pPr>
+      <w:r>
+        <w:rPr>
+          <w:rFonts w:ascii="Segoe UI Semibold" w:eastAsia="Segoe UI Light" w:hAnsi="Segoe UI Semibold" w:cs="Segoe UI Semibold"/>
+          <w:b/>
+          <w:color w:val="0078D4"/>
+          <w:sz w:val="22"/>
+          <w:szCs w:val="52"/>
+        </w:rPr>
+        <w:t xml:space="preserve">7. </w:t>
+      </w:r>
+      <w:r>
+        <w:rPr>
+          <w:rFonts w:ascii="Segoe UI" w:eastAsia="Segoe UI Light" w:hAnsi="Segoe UI" w:cs="Segoe UI"/>
+          <w:color w:val="333333"/>
+          <w:sz w:val="22"/>
+          <w:szCs w:val="52"/>
+        </w:rPr>
+        <w:t>Click Save. The role is created and you'll see the role's privileges page.</w:t>
+      </w:r>
+    </w:p>
+    <w:p>
+      <w:pPr>
+        <w:shd w:val="clear" w:color="auto" w:fill="FFF4CE"/>
+        <w:spacing w:before="200" w:after="100"/>
+        <w:ind w:left="288" w:right="288"/>
+        <w:rPr>
+          <w:rFonts w:ascii="Segoe UI Semibold" w:eastAsia="Segoe UI Light" w:hAnsi="Segoe UI Semibold" w:cs="Segoe UI Semibold"/>
+          <w:color w:val="8764B8"/>
+          <w:sz w:val="28"/>
+          <w:szCs w:val="52"/>
+        </w:rPr>
+      </w:pPr>
+      <w:r>
+        <w:rPr>
+          <w:rFonts w:ascii="Segoe UI Semibold" w:eastAsia="Segoe UI Light" w:hAnsi="Segoe UI Semibold" w:cs="Segoe UI Semibold"/>
+          <w:color w:val="8764B8"/>
+          <w:sz w:val="28"/>
+          <w:szCs w:val="52"/>
+        </w:rPr>
+        <w:t>Step-by-Step: Add Table Permissions to the Role</w:t>
+      </w:r>
+    </w:p>
+    <w:p>
+      <w:pPr>
+        <w:shd w:val="clear" w:color="auto" w:fill="FFF4CE"/>
+        <w:spacing w:before="200" w:after="80"/>
+        <w:ind w:left="288" w:right="288"/>
+        <w:rPr>
+          <w:rFonts w:ascii="Segoe UI" w:eastAsia="Segoe UI Light" w:hAnsi="Segoe UI" w:cs="Segoe UI"/>
+          <w:color w:val="333333"/>
+          <w:sz w:val="22"/>
+          <w:szCs w:val="52"/>
+        </w:rPr>
+      </w:pPr>
+      <w:r>
+        <w:rPr>
+          <w:rFonts w:ascii="Segoe UI Semibold" w:eastAsia="Segoe UI Light" w:hAnsi="Segoe UI Semibold" w:cs="Segoe UI Semibold"/>
+          <w:b/>
+          <w:color w:val="0078D4"/>
+          <w:sz w:val="22"/>
+          <w:szCs w:val="52"/>
+        </w:rPr>
+        <w:t xml:space="preserve">1. </w:t>
+      </w:r>
+      <w:r>
+        <w:rPr>
+          <w:rFonts w:ascii="Segoe UI" w:eastAsia="Segoe UI Light" w:hAnsi="Segoe UI" w:cs="Segoe UI"/>
+          <w:color w:val="333333"/>
+          <w:sz w:val="22"/>
+          <w:szCs w:val="52"/>
+        </w:rPr>
+        <w:t>After saving the new role, you'll see the privileges editor with a search bar at the top. Type Request Tracker in the search bar to find the custom table.</w:t>
+      </w:r>
+    </w:p>
+    <w:p>
+      <w:pPr>
+        <w:shd w:val="clear" w:color="auto" w:fill="FFF4CE"/>
+        <w:spacing w:before="200" w:after="80"/>
+        <w:ind w:left="288" w:right="288"/>
+        <w:rPr>
+          <w:rFonts w:ascii="Segoe UI" w:eastAsia="Segoe UI Light" w:hAnsi="Segoe UI" w:cs="Segoe UI"/>
+          <w:color w:val="333333"/>
+          <w:sz w:val="22"/>
+          <w:szCs w:val="52"/>
+        </w:rPr>
+      </w:pPr>
+      <w:r>
+        <w:rPr>
+          <w:rFonts w:ascii="Segoe UI Semibold" w:eastAsia="Segoe UI Light" w:hAnsi="Segoe UI Semibold" w:cs="Segoe UI Semibold"/>
+          <w:b/>
+          <w:color w:val="0078D4"/>
+          <w:sz w:val="22"/>
+          <w:szCs w:val="52"/>
+        </w:rPr>
+        <w:t xml:space="preserve">2. </w:t>
+      </w:r>
+      <w:r>
+        <w:rPr>
+          <w:rFonts w:ascii="Segoe UI" w:eastAsia="Segoe UI Light" w:hAnsi="Segoe UI" w:cs="Segoe UI"/>
+          <w:color w:val="333333"/>
+          <w:sz w:val="22"/>
+          <w:szCs w:val="52"/>
+        </w:rPr>
+        <w:t>The Request Tracker table will appear in the results. You'll see a row of permission columns: Create, Read, Write, Delete, Append, and Append To.</w:t>
+      </w:r>
+    </w:p>
+    <w:p>
+      <w:pPr>
+        <w:shd w:val="clear" w:color="auto" w:fill="FFF4CE"/>
+        <w:spacing w:before="200" w:after="80"/>
+        <w:ind w:left="288" w:right="288"/>
+        <w:rPr>
+          <w:rFonts w:ascii="Segoe UI" w:eastAsia="Segoe UI Light" w:hAnsi="Segoe UI" w:cs="Segoe UI"/>
+          <w:color w:val="333333"/>
+          <w:sz w:val="22"/>
+          <w:szCs w:val="52"/>
+        </w:rPr>
+      </w:pPr>
+      <w:r>
+        <w:rPr>
+          <w:rFonts w:ascii="Segoe UI Semibold" w:eastAsia="Segoe UI Light" w:hAnsi="Segoe UI Semibold" w:cs="Segoe UI Semibold"/>
+          <w:b/>
+          <w:color w:val="0078D4"/>
+          <w:sz w:val="22"/>
+          <w:szCs w:val="52"/>
+        </w:rPr>
+        <w:t xml:space="preserve">3. </w:t>
+      </w:r>
+      <w:r>
+        <w:rPr>
+          <w:rFonts w:ascii="Segoe UI" w:eastAsia="Segoe UI Light" w:hAnsi="Segoe UI" w:cs="Segoe UI"/>
+          <w:color w:val="333333"/>
+          <w:sz w:val="22"/>
+          <w:szCs w:val="52"/>
+        </w:rPr>
+        <w:t>Click on each permission icon to set it to Organization level (the full green circle). Click each cell under these columns:</w:t>
+      </w:r>
+    </w:p>
+    <w:p>
+      <w:pPr>
+        <w:shd w:val="clear" w:color="auto" w:fill="FFF4CE"/>
+        <w:spacing w:before="200" w:after="40"/>
+        <w:ind w:left="576" w:right="288"/>
+        <w:rPr>
+          <w:rFonts w:ascii="Segoe UI" w:eastAsia="Segoe UI Light" w:hAnsi="Segoe UI" w:cs="Segoe UI"/>
+          <w:color w:val="333333"/>
+          <w:sz w:val="22"/>
+          <w:szCs w:val="52"/>
+        </w:rPr>
+      </w:pPr>
+      <w:r>
+        <w:rPr>
+          <w:rFonts w:ascii="Segoe UI" w:eastAsia="Segoe UI Light" w:hAnsi="Segoe UI" w:cs="Segoe UI"/>
+          <w:color w:val="333333"/>
+          <w:sz w:val="22"/>
+          <w:szCs w:val="52"/>
+        </w:rPr>
+        <w:t>• Create — click until you see the full green circle (Organization)</w:t>
+      </w:r>
+    </w:p>
+    <w:p>
+      <w:pPr>
+        <w:shd w:val="clear" w:color="auto" w:fill="FFF4CE"/>
+        <w:spacing w:before="200" w:after="40"/>
+        <w:ind w:left="576" w:right="288"/>
+        <w:rPr>
+          <w:rFonts w:ascii="Segoe UI" w:eastAsia="Segoe UI Light" w:hAnsi="Segoe UI" w:cs="Segoe UI"/>
+          <w:color w:val="333333"/>
+          <w:sz w:val="22"/>
+          <w:szCs w:val="52"/>
+        </w:rPr>
+      </w:pPr>
+      <w:r>
+        <w:rPr>
+          <w:rFonts w:ascii="Segoe UI" w:eastAsia="Segoe UI Light" w:hAnsi="Segoe UI" w:cs="Segoe UI"/>
+          <w:color w:val="333333"/>
+          <w:sz w:val="22"/>
+          <w:szCs w:val="52"/>
+        </w:rPr>
+        <w:t>• Read — click until you see the full green circle (Organization)</w:t>
+      </w:r>
+    </w:p>
+    <w:p>
+      <w:pPr>
+        <w:shd w:val="clear" w:color="auto" w:fill="FFF4CE"/>
+        <w:spacing w:before="200" w:after="40"/>
+        <w:ind w:left="576" w:right="288"/>
+        <w:rPr>
+          <w:rFonts w:ascii="Segoe UI" w:eastAsia="Segoe UI Light" w:hAnsi="Segoe UI" w:cs="Segoe UI"/>
+          <w:color w:val="333333"/>
+          <w:sz w:val="22"/>
+          <w:szCs w:val="52"/>
+        </w:rPr>
+      </w:pPr>
+      <w:r>
+        <w:rPr>
+          <w:rFonts w:ascii="Segoe UI" w:eastAsia="Segoe UI Light" w:hAnsi="Segoe UI" w:cs="Segoe UI"/>
+          <w:color w:val="333333"/>
+          <w:sz w:val="22"/>
+          <w:szCs w:val="52"/>
+        </w:rPr>
+        <w:t>• Write — click until you see the full green circle (Organization)</w:t>
+      </w:r>
+    </w:p>
+    <w:p>
+      <w:pPr>
+        <w:shd w:val="clear" w:color="auto" w:fill="FFF4CE"/>
+        <w:spacing w:before="200" w:after="40"/>
+        <w:ind w:left="576" w:right="288"/>
+        <w:rPr>
+          <w:rFonts w:ascii="Segoe UI" w:eastAsia="Segoe UI Light" w:hAnsi="Segoe UI" w:cs="Segoe UI"/>
+          <w:color w:val="333333"/>
+          <w:sz w:val="22"/>
+          <w:szCs w:val="52"/>
+        </w:rPr>
+      </w:pPr>
+      <w:r>
+        <w:rPr>
+          <w:rFonts w:ascii="Segoe UI" w:eastAsia="Segoe UI Light" w:hAnsi="Segoe UI" w:cs="Segoe UI"/>
+          <w:color w:val="333333"/>
+          <w:sz w:val="22"/>
+          <w:szCs w:val="52"/>
+        </w:rPr>
+        <w:t>• Delete — click until you see the full green circle (Organization)</w:t>
+      </w:r>
+    </w:p>
+    <w:p>
+      <w:pPr>
+        <w:shd w:val="clear" w:color="auto" w:fill="FFF4CE"/>
+        <w:spacing w:before="200" w:after="40"/>
+        <w:ind w:left="576" w:right="288"/>
+        <w:rPr>
+          <w:rFonts w:ascii="Segoe UI" w:eastAsia="Segoe UI Light" w:hAnsi="Segoe UI" w:cs="Segoe UI"/>
+          <w:color w:val="333333"/>
+          <w:sz w:val="22"/>
+          <w:szCs w:val="52"/>
+        </w:rPr>
+      </w:pPr>
+      <w:r>
+        <w:rPr>
+          <w:rFonts w:ascii="Segoe UI" w:eastAsia="Segoe UI Light" w:hAnsi="Segoe UI" w:cs="Segoe UI"/>
+          <w:color w:val="333333"/>
+          <w:sz w:val="22"/>
+          <w:szCs w:val="52"/>
+        </w:rPr>
+        <w:t>• Append — click until you see the full green circle (Organization)</w:t>
+      </w:r>
+    </w:p>
+    <w:p>
+      <w:pPr>
+        <w:shd w:val="clear" w:color="auto" w:fill="FFF4CE"/>
+        <w:spacing w:before="200" w:after="40"/>
+        <w:ind w:left="576" w:right="288"/>
+        <w:rPr>
+          <w:rFonts w:ascii="Segoe UI" w:eastAsia="Segoe UI Light" w:hAnsi="Segoe UI" w:cs="Segoe UI"/>
+          <w:color w:val="333333"/>
+          <w:sz w:val="22"/>
+          <w:szCs w:val="52"/>
+        </w:rPr>
+      </w:pPr>
+      <w:r>
+        <w:rPr>
+          <w:rFonts w:ascii="Segoe UI" w:eastAsia="Segoe UI Light" w:hAnsi="Segoe UI" w:cs="Segoe UI"/>
+          <w:color w:val="333333"/>
+          <w:sz w:val="22"/>
+          <w:szCs w:val="52"/>
+        </w:rPr>
+        <w:t>• Append To — click until you see the full green circle (Organization)</w:t>
+      </w:r>
+    </w:p>
+    <w:p>
+      <w:pPr>
+        <w:shd w:val="clear" w:color="auto" w:fill="E0F6FC"/>
+        <w:spacing w:before="120" w:after="120"/>
+        <w:ind w:left="288" w:right="288"/>
+        <w:rPr>
+          <w:rFonts w:ascii="Segoe UI" w:eastAsia="Segoe UI Light" w:hAnsi="Segoe UI" w:cs="Segoe UI"/>
+          <w:color w:val="333333"/>
+          <w:sz w:val="22"/>
+          <w:szCs w:val="52"/>
+        </w:rPr>
+      </w:pPr>
+      <w:r>
+        <w:rPr>
+          <w:rFonts w:ascii="Segoe UI Emoji" w:eastAsia="Segoe UI Light" w:hAnsi="Segoe UI Emoji" w:cs="Segoe UI Emoji"/>
+          <w:color w:val="0078D4"/>
+          <w:sz w:val="22"/>
+          <w:szCs w:val="52"/>
+        </w:rPr>
+        <w:t>💡</w:t>
+      </w:r>
+      <w:r>
+        <w:rPr>
+          <w:rFonts w:ascii="Segoe UI Semibold" w:eastAsia="Segoe UI Light" w:hAnsi="Segoe UI Semibold" w:cs="Segoe UI Semibold"/>
+          <w:color w:val="0078D4"/>
+          <w:sz w:val="22"/>
+          <w:szCs w:val="52"/>
+        </w:rPr>
+        <w:t xml:space="preserve"> Tip: </w:t>
+      </w:r>
+      <w:r>
+        <w:rPr>
+          <w:rFonts w:ascii="Segoe UI" w:eastAsia="Segoe UI Light" w:hAnsi="Segoe UI" w:cs="Segoe UI"/>
+          <w:color w:val="333333"/>
+          <w:sz w:val="22"/>
+          <w:szCs w:val="52"/>
+        </w:rPr>
+        <w:t>Each click cycles through permission levels: None → User → Business Unit → Parent: Child Business Units → Organization. Keep clicking until the circle is fully filled. You can also right-click a cell to see a dropdown of all available levels.</w:t>
+      </w:r>
+    </w:p>
+    <w:p>
+      <w:pPr>
+        <w:shd w:val="clear" w:color="auto" w:fill="E0F6FC"/>
+        <w:spacing w:before="120" w:after="80"/>
+        <w:ind w:left="288" w:right="288"/>
+        <w:rPr>
+          <w:rFonts w:ascii="Segoe UI" w:eastAsia="Segoe UI Light" w:hAnsi="Segoe UI" w:cs="Segoe UI"/>
+          <w:color w:val="333333"/>
+          <w:sz w:val="22"/>
+          <w:szCs w:val="52"/>
+        </w:rPr>
+      </w:pPr>
+      <w:r>
+        <w:rPr>
+          <w:rFonts w:ascii="Segoe UI Semibold" w:eastAsia="Segoe UI Light" w:hAnsi="Segoe UI Semibold" w:cs="Segoe UI Semibold"/>
+          <w:b/>
+          <w:color w:val="0078D4"/>
+          <w:sz w:val="22"/>
+          <w:szCs w:val="52"/>
+        </w:rPr>
+        <w:t xml:space="preserve">4. </w:t>
+      </w:r>
+      <w:r>
+        <w:rPr>
+          <w:rFonts w:ascii="Segoe UI" w:eastAsia="Segoe UI Light" w:hAnsi="Segoe UI" w:cs="Segoe UI"/>
+          <w:color w:val="333333"/>
+          <w:sz w:val="22"/>
+          <w:szCs w:val="52"/>
+        </w:rPr>
+        <w:t>Click Save + close in the top command bar to save the role.</w:t>
+      </w:r>
+    </w:p>
+    <w:p>
+      <w:pPr>
+        <w:shd w:val="clear" w:color="auto" w:fill="E0F6FC"/>
+        <w:spacing w:before="200" w:after="100"/>
+        <w:ind w:left="288" w:right="288"/>
+        <w:rPr>
+          <w:rFonts w:ascii="Segoe UI Semibold" w:eastAsia="Segoe UI Light" w:hAnsi="Segoe UI Semibold" w:cs="Segoe UI Semibold"/>
+          <w:color w:val="8764B8"/>
+          <w:sz w:val="28"/>
+          <w:szCs w:val="52"/>
+        </w:rPr>
+      </w:pPr>
+      <w:r>
+        <w:rPr>
+          <w:rFonts w:ascii="Segoe UI Semibold" w:eastAsia="Segoe UI Light" w:hAnsi="Segoe UI Semibold" w:cs="Segoe UI Semibold"/>
+          <w:color w:val="8764B8"/>
+          <w:sz w:val="28"/>
+          <w:szCs w:val="52"/>
+        </w:rPr>
+        <w:t>Step-by-Step: Assign the Role to Users</w:t>
+      </w:r>
+    </w:p>
+    <w:p>
+      <w:pPr>
+        <w:shd w:val="clear" w:color="auto" w:fill="E0F6FC"/>
+        <w:spacing w:before="200" w:after="80"/>
+        <w:ind w:left="288" w:right="288"/>
+        <w:rPr>
+          <w:rFonts w:ascii="Segoe UI" w:eastAsia="Segoe UI Light" w:hAnsi="Segoe UI" w:cs="Segoe UI"/>
+          <w:color w:val="333333"/>
+          <w:sz w:val="22"/>
+          <w:szCs w:val="52"/>
+        </w:rPr>
+      </w:pPr>
+      <w:r>
+        <w:rPr>
+          <w:rFonts w:ascii="Segoe UI Semibold" w:eastAsia="Segoe UI Light" w:hAnsi="Segoe UI Semibold" w:cs="Segoe UI Semibold"/>
+          <w:b/>
+          <w:color w:val="0078D4"/>
+          <w:sz w:val="22"/>
+          <w:szCs w:val="52"/>
+        </w:rPr>
+        <w:t xml:space="preserve">1. </w:t>
+      </w:r>
+      <w:r>
+        <w:rPr>
+          <w:rFonts w:ascii="Segoe UI" w:eastAsia="Segoe UI Light" w:hAnsi="Segoe UI" w:cs="Segoe UI"/>
+          <w:color w:val="333333"/>
+          <w:sz w:val="22"/>
+          <w:szCs w:val="52"/>
+        </w:rPr>
+        <w:t>Go back to Settings &gt; Users + permissions &gt; Users in the Power Platform Admin Center.</w:t>
+      </w:r>
+    </w:p>
+    <w:p>
+      <w:pPr>
+        <w:shd w:val="clear" w:color="auto" w:fill="E0F6FC"/>
+        <w:spacing w:before="200" w:after="80"/>
+        <w:ind w:left="288" w:right="288"/>
+        <w:rPr>
+          <w:rFonts w:ascii="Segoe UI" w:eastAsia="Segoe UI Light" w:hAnsi="Segoe UI" w:cs="Segoe UI"/>
+          <w:color w:val="333333"/>
+          <w:sz w:val="22"/>
+          <w:szCs w:val="52"/>
+        </w:rPr>
+      </w:pPr>
+      <w:r>
+        <w:rPr>
+          <w:rFonts w:ascii="Segoe UI Semibold" w:eastAsia="Segoe UI Light" w:hAnsi="Segoe UI Semibold" w:cs="Segoe UI Semibold"/>
+          <w:b/>
+          <w:color w:val="0078D4"/>
+          <w:sz w:val="22"/>
+          <w:szCs w:val="52"/>
+        </w:rPr>
+        <w:t xml:space="preserve">2. </w:t>
+      </w:r>
+      <w:r>
+        <w:rPr>
+          <w:rFonts w:ascii="Segoe UI" w:eastAsia="Segoe UI Light" w:hAnsi="Segoe UI" w:cs="Segoe UI"/>
+          <w:color w:val="333333"/>
+          <w:sz w:val="22"/>
+          <w:szCs w:val="52"/>
+        </w:rPr>
+        <w:t>Find the user you want to grant access to. Use the search bar to search by name or email.</w:t>
+      </w:r>
+    </w:p>
+    <w:p>
+      <w:pPr>
+        <w:shd w:val="clear" w:color="auto" w:fill="E0F6FC"/>
+        <w:spacing w:before="200" w:after="80"/>
+        <w:ind w:left="288" w:right="288"/>
+        <w:rPr>
+          <w:rFonts w:ascii="Segoe UI" w:eastAsia="Segoe UI Light" w:hAnsi="Segoe UI" w:cs="Segoe UI"/>
+          <w:color w:val="333333"/>
+          <w:sz w:val="22"/>
+          <w:szCs w:val="52"/>
+        </w:rPr>
+      </w:pPr>
+      <w:r>
+        <w:rPr>
+          <w:rFonts w:ascii="Segoe UI Semibold" w:eastAsia="Segoe UI Light" w:hAnsi="Segoe UI Semibold" w:cs="Segoe UI Semibold"/>
+          <w:b/>
+          <w:color w:val="0078D4"/>
+          <w:sz w:val="22"/>
+          <w:szCs w:val="52"/>
+        </w:rPr>
+        <w:t xml:space="preserve">3. </w:t>
+      </w:r>
+      <w:r>
+        <w:rPr>
+          <w:rFonts w:ascii="Segoe UI" w:eastAsia="Segoe UI Light" w:hAnsi="Segoe UI" w:cs="Segoe UI"/>
+          <w:color w:val="333333"/>
+          <w:sz w:val="22"/>
+          <w:szCs w:val="52"/>
+        </w:rPr>
+        <w:t>Click on the user's name to open their details.</w:t>
+      </w:r>
+    </w:p>
+    <w:p>
+      <w:pPr>
+        <w:shd w:val="clear" w:color="auto" w:fill="E0F6FC"/>
+        <w:spacing w:before="200" w:after="80"/>
+        <w:ind w:left="288" w:right="288"/>
+        <w:rPr>
+          <w:rFonts w:ascii="Segoe UI" w:eastAsia="Segoe UI Light" w:hAnsi="Segoe UI" w:cs="Segoe UI"/>
+          <w:color w:val="333333"/>
+          <w:sz w:val="22"/>
+          <w:szCs w:val="52"/>
+        </w:rPr>
+      </w:pPr>
+      <w:r>
+        <w:rPr>
+          <w:rFonts w:ascii="Segoe UI Semibold" w:eastAsia="Segoe UI Light" w:hAnsi="Segoe UI Semibold" w:cs="Segoe UI Semibold"/>
+          <w:b/>
+          <w:color w:val="0078D4"/>
+          <w:sz w:val="22"/>
+          <w:szCs w:val="52"/>
+        </w:rPr>
+        <w:t xml:space="preserve">4. </w:t>
+      </w:r>
+      <w:r>
+        <w:rPr>
+          <w:rFonts w:ascii="Segoe UI" w:eastAsia="Segoe UI Light" w:hAnsi="Segoe UI" w:cs="Segoe UI"/>
+          <w:color w:val="333333"/>
+          <w:sz w:val="22"/>
+          <w:szCs w:val="52"/>
+        </w:rPr>
+        <w:t>Click Manage security roles in the top command bar.</w:t>
+      </w:r>
+    </w:p>
+    <w:p>
+      <w:pPr>
+        <w:shd w:val="clear" w:color="auto" w:fill="E0F6FC"/>
+        <w:spacing w:before="200" w:after="80"/>
+        <w:ind w:left="288" w:right="288"/>
+        <w:rPr>
+          <w:rFonts w:ascii="Segoe UI" w:eastAsia="Segoe UI Light" w:hAnsi="Segoe UI" w:cs="Segoe UI"/>
+          <w:color w:val="333333"/>
+          <w:sz w:val="22"/>
+          <w:szCs w:val="52"/>
+        </w:rPr>
+      </w:pPr>
+      <w:r>
+        <w:rPr>
+          <w:rFonts w:ascii="Segoe UI Semibold" w:eastAsia="Segoe UI Light" w:hAnsi="Segoe UI Semibold" w:cs="Segoe UI Semibold"/>
+          <w:b/>
+          <w:color w:val="0078D4"/>
+          <w:sz w:val="22"/>
+          <w:szCs w:val="52"/>
+        </w:rPr>
+        <w:t xml:space="preserve">5. </w:t>
+      </w:r>
+      <w:r>
+        <w:rPr>
+          <w:rFonts w:ascii="Segoe UI" w:eastAsia="Segoe UI Light" w:hAnsi="Segoe UI" w:cs="Segoe UI"/>
+          <w:color w:val="333333"/>
+          <w:sz w:val="22"/>
+          <w:szCs w:val="52"/>
+        </w:rPr>
+        <w:t>In the security roles panel, search for Request Tracker User and check the box next to it.</w:t>
+      </w:r>
+    </w:p>
+    <w:p>
+      <w:pPr>
+        <w:shd w:val="clear" w:color="auto" w:fill="E0F6FC"/>
+        <w:spacing w:before="200" w:after="80"/>
+        <w:ind w:left="288" w:right="288"/>
+        <w:rPr>
+          <w:rFonts w:ascii="Segoe UI" w:eastAsia="Segoe UI Light" w:hAnsi="Segoe UI" w:cs="Segoe UI"/>
+          <w:color w:val="333333"/>
+          <w:sz w:val="22"/>
+          <w:szCs w:val="52"/>
+        </w:rPr>
+      </w:pPr>
+      <w:r>
+        <w:rPr>
+          <w:rFonts w:ascii="Segoe UI Semibold" w:eastAsia="Segoe UI Light" w:hAnsi="Segoe UI Semibold" w:cs="Segoe UI Semibold"/>
+          <w:b/>
+          <w:color w:val="0078D4"/>
+          <w:sz w:val="22"/>
+          <w:szCs w:val="52"/>
+        </w:rPr>
+        <w:t xml:space="preserve">6. </w:t>
+      </w:r>
+      <w:r>
+        <w:rPr>
+          <w:rFonts w:ascii="Segoe UI" w:eastAsia="Segoe UI Light" w:hAnsi="Segoe UI" w:cs="Segoe UI"/>
+          <w:color w:val="333333"/>
+          <w:sz w:val="22"/>
+          <w:szCs w:val="52"/>
+        </w:rPr>
+        <w:t>Click Save. The user now has the correct permissions to interact with the Request Tracker Dataverse table through the agent.</w:t>
+      </w:r>
+    </w:p>
+    <w:p>
+      <w:pPr>
+        <w:shd w:val="clear" w:color="auto" w:fill="E0F6FC"/>
+        <w:spacing w:before="200" w:after="80"/>
+        <w:ind w:left="288" w:right="288"/>
+        <w:rPr>
+          <w:rFonts w:ascii="Segoe UI" w:eastAsia="Segoe UI Light" w:hAnsi="Segoe UI" w:cs="Segoe UI"/>
+          <w:color w:val="333333"/>
+          <w:sz w:val="22"/>
+          <w:szCs w:val="52"/>
+        </w:rPr>
+      </w:pPr>
+      <w:r>
+        <w:rPr>
+          <w:rFonts w:ascii="Segoe UI Semibold" w:eastAsia="Segoe UI Light" w:hAnsi="Segoe UI Semibold" w:cs="Segoe UI Semibold"/>
+          <w:b/>
+          <w:color w:val="0078D4"/>
+          <w:sz w:val="22"/>
+          <w:szCs w:val="52"/>
+        </w:rPr>
+        <w:t xml:space="preserve">7. </w:t>
+      </w:r>
+      <w:r>
+        <w:rPr>
+          <w:rFonts w:ascii="Segoe UI" w:eastAsia="Segoe UI Light" w:hAnsi="Segoe UI" w:cs="Segoe UI"/>
+          <w:color w:val="333333"/>
+          <w:sz w:val="22"/>
+          <w:szCs w:val="52"/>
+        </w:rPr>
+        <w:t>Repeat steps 2-6 for each additional user who needs access to the agent.</w:t>
+      </w:r>
+    </w:p>
+    <w:p>
+      <w:pPr>
+        <w:shd w:val="clear" w:color="auto" w:fill="E0F6FC"/>
+        <w:spacing w:before="120" w:after="120"/>
+        <w:ind w:left="288" w:right="288"/>
+        <w:rPr>
+          <w:rFonts w:ascii="Segoe UI" w:eastAsia="Segoe UI Light" w:hAnsi="Segoe UI" w:cs="Segoe UI"/>
+          <w:color w:val="333333"/>
+          <w:sz w:val="22"/>
+          <w:szCs w:val="52"/>
+        </w:rPr>
+      </w:pPr>
+      <w:r>
+        <w:rPr>
+          <w:rFonts w:ascii="Segoe UI Emoji" w:eastAsia="Segoe UI Light" w:hAnsi="Segoe UI Emoji" w:cs="Segoe UI Emoji"/>
+          <w:color w:val="0078D4"/>
+          <w:sz w:val="22"/>
+          <w:szCs w:val="52"/>
+        </w:rPr>
+        <w:t>💡</w:t>
+      </w:r>
+      <w:r>
+        <w:rPr>
+          <w:rFonts w:ascii="Segoe UI Semibold" w:eastAsia="Segoe UI Light" w:hAnsi="Segoe UI Semibold" w:cs="Segoe UI Semibold"/>
+          <w:color w:val="0078D4"/>
+          <w:sz w:val="22"/>
+          <w:szCs w:val="52"/>
+        </w:rPr>
+        <w:t xml:space="preserve"> Tip: </w:t>
+      </w:r>
+      <w:r>
+        <w:rPr>
+          <w:rFonts w:ascii="Segoe UI" w:eastAsia="Segoe UI Light" w:hAnsi="Segoe UI" w:cs="Segoe UI"/>
+          <w:color w:val="333333"/>
+          <w:sz w:val="22"/>
+          <w:szCs w:val="52"/>
+        </w:rPr>
+        <w:t>For large teams, consider assigning the security role to a Microsoft Entra security group instead of individual users. Go to Users + permissions &gt; Teams, create a new team linked to an Entra security group, and assign the 'Request Tracker User' role to the team. All members of that group will automatically inherit the permissions.</w:t>
+      </w:r>
+    </w:p>
+    <w:p>
+      <w:pPr>
+        <w:shd w:val="clear" w:color="auto" w:fill="FFF4CE"/>
+        <w:spacing w:before="120" w:after="120"/>
+        <w:ind w:left="288" w:right="288"/>
+        <w:rPr>
+          <w:rFonts w:ascii="Segoe UI" w:eastAsia="Segoe UI Light" w:hAnsi="Segoe UI" w:cs="Segoe UI"/>
+          <w:color w:val="333333"/>
+          <w:sz w:val="22"/>
+          <w:szCs w:val="52"/>
+        </w:rPr>
+      </w:pPr>
+      <w:r>
+        <w:rPr>
+          <w:rFonts w:ascii="Segoe UI Emoji" w:eastAsia="Segoe UI Light" w:hAnsi="Segoe UI Emoji" w:cs="Segoe UI Emoji"/>
+          <w:color w:val="D4A017"/>
+          <w:sz w:val="22"/>
+          <w:szCs w:val="52"/>
+        </w:rPr>
+        <w:t>⚠️</w:t>
+      </w:r>
+      <w:r>
+        <w:rPr>
+          <w:rFonts w:ascii="Segoe UI Semibold" w:eastAsia="Segoe UI Light" w:hAnsi="Segoe UI Semibold" w:cs="Segoe UI Semibold"/>
+          <w:color w:val="D4A017"/>
+          <w:sz w:val="22"/>
+          <w:szCs w:val="52"/>
+        </w:rPr>
+        <w:t xml:space="preserve"> Note: </w:t>
+      </w:r>
+      <w:r>
+        <w:rPr>
+          <w:rFonts w:ascii="Segoe UI" w:eastAsia="Segoe UI Light" w:hAnsi="Segoe UI" w:cs="Segoe UI"/>
+          <w:color w:val="333333"/>
+          <w:sz w:val="22"/>
+          <w:szCs w:val="52"/>
+        </w:rPr>
+        <w:t>Users will also need the Basic User role (or equivalent) to sign in to the environment. Most users already have this. If a user gets an 'access denied' error when opening the agent, check that they also have the Basic User role assigned.</w:t>
+      </w:r>
+    </w:p>
+    <w:p>
+      <w:pPr>
+        <w:shd w:val="clear" w:color="auto" w:fill="FFF4CE"/>
+        <w:spacing w:before="200" w:after="100"/>
+        <w:ind w:left="288" w:right="288"/>
+        <w:rPr>
+          <w:rFonts w:ascii="Segoe UI Semibold" w:eastAsia="Segoe UI Light" w:hAnsi="Segoe UI Semibold" w:cs="Segoe UI Semibold"/>
+          <w:color w:val="8764B8"/>
+          <w:sz w:val="28"/>
+          <w:szCs w:val="52"/>
+        </w:rPr>
+      </w:pPr>
+      <w:r>
+        <w:rPr>
+          <w:rFonts w:ascii="Segoe UI Semibold" w:eastAsia="Segoe UI Light" w:hAnsi="Segoe UI Semibold" w:cs="Segoe UI Semibold"/>
+          <w:color w:val="8764B8"/>
+          <w:sz w:val="28"/>
+          <w:szCs w:val="52"/>
+        </w:rPr>
+        <w:t>Troubleshooting</w:t>
+      </w:r>
+    </w:p>
+    <w:tbl>
+      <w:tblPr>
+        <w:tblW w:w="5000" w:type="pct"/>
+        <w:tblLayout w:type="fixed"/>
+        <w:tblLook w:val="0000" w:firstRow="0" w:lastRow="0" w:firstColumn="0" w:lastColumn="0" w:noHBand="0" w:noVBand="0"/>
+      </w:tblPr>
+      <w:tblGrid>
+        <w:gridCol w:w="4513"/>
+        <w:gridCol w:w="4513"/>
+      </w:tblGrid>
+      <w:tr>
+        <w:tblPrEx>
+          <w:tblCellMar>
+            <w:top w:w="0" w:type="dxa"/>
+            <w:bottom w:w="0" w:type="dxa"/>
+          </w:tblCellMar>
+        </w:tblPrEx>
+        <w:tc>
+          <w:tcPr>
+            <w:tcW w:w="4513" w:type="dxa"/>
+            <w:shd w:val="clear" w:color="auto" w:fill="0078D4"/>
+          </w:tcPr>
+          <w:p>
+            <w:pPr>
+              <w:spacing w:before="200" w:after="100"/>
+              <w:ind w:right="288"/>
+              <w:rPr>
+                <w:rFonts w:ascii="Segoe UI Semibold" w:eastAsia="Segoe UI Light" w:hAnsi="Segoe UI Semibold" w:cs="Segoe UI Semibold"/>
+                <w:b/>
+                <w:color w:val="FFFFFF"/>
+                <w:szCs w:val="52"/>
+              </w:rPr>
+            </w:pPr>
+            <w:r>
+              <w:rPr>
+                <w:rFonts w:ascii="Segoe UI Semibold" w:eastAsia="Segoe UI Light" w:hAnsi="Segoe UI Semibold" w:cs="Segoe UI Semibold"/>
+                <w:b/>
+                <w:color w:val="FFFFFF"/>
+                <w:szCs w:val="52"/>
+              </w:rPr>
+              <w:t>Problem</w:t>
+            </w:r>
+          </w:p>
+        </w:tc>
+        <w:tc>
+          <w:tcPr>
+            <w:tcW w:w="4513" w:type="dxa"/>
+            <w:shd w:val="clear" w:color="auto" w:fill="0078D4"/>
+          </w:tcPr>
+          <w:p>
+            <w:pPr>
+              <w:spacing w:before="200" w:after="100"/>
+              <w:ind w:right="288"/>
+              <w:rPr>
+                <w:rFonts w:ascii="Segoe UI Semibold" w:eastAsia="Segoe UI Light" w:hAnsi="Segoe UI Semibold" w:cs="Segoe UI Semibold"/>
+                <w:b/>
+                <w:color w:val="FFFFFF"/>
+                <w:szCs w:val="52"/>
+              </w:rPr>
+            </w:pPr>
+            <w:r>
+              <w:rPr>
+                <w:rFonts w:ascii="Segoe UI Semibold" w:eastAsia="Segoe UI Light" w:hAnsi="Segoe UI Semibold" w:cs="Segoe UI Semibold"/>
+                <w:b/>
+                <w:color w:val="FFFFFF"/>
+                <w:szCs w:val="52"/>
+              </w:rPr>
+              <w:t>Fix</w:t>
+            </w:r>
+          </w:p>
+        </w:tc>
+      </w:tr>
+      <w:tr>
+        <w:tblPrEx>
+          <w:tblCellMar>
+            <w:top w:w="0" w:type="dxa"/>
+            <w:bottom w:w="0" w:type="dxa"/>
+          </w:tblCellMar>
+        </w:tblPrEx>
+        <w:tc>
+          <w:tcPr>
+            <w:tcW w:w="4513" w:type="dxa"/>
+            <w:shd w:val="clear" w:color="auto" w:fill="F5F5F5"/>
+          </w:tcPr>
+          <w:p>
+            <w:pPr>
+              <w:spacing w:before="200" w:after="100"/>
+              <w:ind w:right="288"/>
+              <w:rPr>
+                <w:rFonts w:ascii="Segoe UI" w:eastAsia="Segoe UI Light" w:hAnsi="Segoe UI" w:cs="Segoe UI"/>
+                <w:color w:val="333333"/>
+                <w:szCs w:val="52"/>
+              </w:rPr>
+            </w:pPr>
+            <w:r>
+              <w:rPr>
+                <w:rFonts w:ascii="Segoe UI" w:eastAsia="Segoe UI Light" w:hAnsi="Segoe UI" w:cs="Segoe UI"/>
+                <w:color w:val="333333"/>
+                <w:szCs w:val="52"/>
+              </w:rPr>
+              <w:t>User gets 'You do not have permission' error</w:t>
+            </w:r>
+          </w:p>
+        </w:tc>
+        <w:tc>
+          <w:tcPr>
+            <w:tcW w:w="4513" w:type="dxa"/>
+            <w:shd w:val="clear" w:color="auto" w:fill="F5F5F5"/>
+          </w:tcPr>
+          <w:p>
+            <w:pPr>
+              <w:spacing w:before="200" w:after="100"/>
+              <w:ind w:right="288"/>
+              <w:rPr>
+                <w:rFonts w:ascii="Segoe UI" w:eastAsia="Segoe UI Light" w:hAnsi="Segoe UI" w:cs="Segoe UI"/>
+                <w:color w:val="333333"/>
+                <w:szCs w:val="52"/>
+              </w:rPr>
+            </w:pPr>
+            <w:r>
+              <w:rPr>
+                <w:rFonts w:ascii="Segoe UI" w:eastAsia="Segoe UI Light" w:hAnsi="Segoe UI" w:cs="Segoe UI"/>
+                <w:color w:val="333333"/>
+                <w:szCs w:val="52"/>
+              </w:rPr>
+              <w:t>The user is missing the Request Tracker User security role. Assign it via Power Platform Admin Center &gt; Users.</w:t>
+            </w:r>
+          </w:p>
+        </w:tc>
+      </w:tr>
+      <w:tr>
+        <w:tblPrEx>
+          <w:tblCellMar>
+            <w:top w:w="0" w:type="dxa"/>
+            <w:bottom w:w="0" w:type="dxa"/>
+          </w:tblCellMar>
+        </w:tblPrEx>
+        <w:tc>
+          <w:tcPr>
+            <w:tcW w:w="4513" w:type="dxa"/>
+            <w:shd w:val="clear" w:color="auto" w:fill="FFFFFF"/>
+          </w:tcPr>
+          <w:p>
+            <w:pPr>
+              <w:spacing w:before="200" w:after="100"/>
+              <w:ind w:right="288"/>
+              <w:rPr>
+                <w:rFonts w:ascii="Segoe UI" w:eastAsia="Segoe UI Light" w:hAnsi="Segoe UI" w:cs="Segoe UI"/>
+                <w:color w:val="333333"/>
+                <w:szCs w:val="52"/>
+              </w:rPr>
+            </w:pPr>
+            <w:r>
+              <w:rPr>
+                <w:rFonts w:ascii="Segoe UI" w:eastAsia="Segoe UI Light" w:hAnsi="Segoe UI" w:cs="Segoe UI"/>
+                <w:color w:val="333333"/>
+                <w:szCs w:val="52"/>
+              </w:rPr>
+              <w:t>'Request Tracker' table not showing in security role editor</w:t>
+            </w:r>
+          </w:p>
+        </w:tc>
+        <w:tc>
+          <w:tcPr>
+            <w:tcW w:w="4513" w:type="dxa"/>
+            <w:shd w:val="clear" w:color="auto" w:fill="FFFFFF"/>
+          </w:tcPr>
+          <w:p>
+            <w:pPr>
+              <w:spacing w:before="200" w:after="100"/>
+              <w:ind w:right="288"/>
+              <w:rPr>
+                <w:rFonts w:ascii="Segoe UI" w:eastAsia="Segoe UI Light" w:hAnsi="Segoe UI" w:cs="Segoe UI"/>
+                <w:color w:val="333333"/>
+                <w:szCs w:val="52"/>
+              </w:rPr>
+            </w:pPr>
+            <w:r>
+              <w:rPr>
+                <w:rFonts w:ascii="Segoe UI" w:eastAsia="Segoe UI Light" w:hAnsi="Segoe UI" w:cs="Segoe UI"/>
+                <w:color w:val="333333"/>
+                <w:szCs w:val="52"/>
+              </w:rPr>
+              <w:t>Search for the table's internal name (may have a publisher prefix like cr_xxx_requesttracker). Custom table names include the publisher prefix.</w:t>
+            </w:r>
+          </w:p>
+        </w:tc>
+      </w:tr>
+      <w:tr>
+        <w:tblPrEx>
+          <w:tblCellMar>
+            <w:top w:w="0" w:type="dxa"/>
+            <w:bottom w:w="0" w:type="dxa"/>
+          </w:tblCellMar>
+        </w:tblPrEx>
+        <w:tc>
+          <w:tcPr>
+            <w:tcW w:w="4513" w:type="dxa"/>
+            <w:shd w:val="clear" w:color="auto" w:fill="F5F5F5"/>
+          </w:tcPr>
+          <w:p>
+            <w:pPr>
+              <w:spacing w:before="200" w:after="100"/>
+              <w:ind w:right="288"/>
+              <w:rPr>
+                <w:rFonts w:ascii="Segoe UI" w:eastAsia="Segoe UI Light" w:hAnsi="Segoe UI" w:cs="Segoe UI"/>
+                <w:color w:val="333333"/>
+                <w:szCs w:val="52"/>
+              </w:rPr>
+            </w:pPr>
+            <w:r>
+              <w:rPr>
+                <w:rFonts w:ascii="Segoe UI" w:eastAsia="Segoe UI Light" w:hAnsi="Segoe UI" w:cs="Segoe UI"/>
+                <w:color w:val="333333"/>
+                <w:szCs w:val="52"/>
+              </w:rPr>
+              <w:t>User can search but cannot create/update requests</w:t>
+            </w:r>
+          </w:p>
+        </w:tc>
+        <w:tc>
+          <w:tcPr>
+            <w:tcW w:w="4513" w:type="dxa"/>
+            <w:shd w:val="clear" w:color="auto" w:fill="F5F5F5"/>
+          </w:tcPr>
+          <w:p>
+            <w:pPr>
+              <w:spacing w:before="200" w:after="100"/>
+              <w:ind w:right="288"/>
+              <w:rPr>
+                <w:rFonts w:ascii="Segoe UI" w:eastAsia="Segoe UI Light" w:hAnsi="Segoe UI" w:cs="Segoe UI"/>
+                <w:color w:val="333333"/>
+                <w:szCs w:val="52"/>
+              </w:rPr>
+            </w:pPr>
+            <w:r>
+              <w:rPr>
+                <w:rFonts w:ascii="Segoe UI" w:eastAsia="Segoe UI Light" w:hAnsi="Segoe UI" w:cs="Segoe UI"/>
+                <w:color w:val="333333"/>
+                <w:szCs w:val="52"/>
+              </w:rPr>
+              <w:t>The user has Read but is missing Create and/or Write. Edit the security role to add those permissions.</w:t>
+            </w:r>
+          </w:p>
+        </w:tc>
+      </w:tr>
+      <w:tr>
+        <w:tblPrEx>
+          <w:tblCellMar>
+            <w:top w:w="0" w:type="dxa"/>
+            <w:bottom w:w="0" w:type="dxa"/>
+          </w:tblCellMar>
+        </w:tblPrEx>
+        <w:tc>
+          <w:tcPr>
+            <w:tcW w:w="4513" w:type="dxa"/>
+            <w:shd w:val="clear" w:color="auto" w:fill="FFFFFF"/>
+          </w:tcPr>
+          <w:p>
+            <w:pPr>
+              <w:spacing w:before="200" w:after="100"/>
+              <w:ind w:right="288"/>
+              <w:rPr>
+                <w:rFonts w:ascii="Segoe UI" w:eastAsia="Segoe UI Light" w:hAnsi="Segoe UI" w:cs="Segoe UI"/>
+                <w:color w:val="333333"/>
+                <w:szCs w:val="52"/>
+              </w:rPr>
+            </w:pPr>
+            <w:r>
+              <w:rPr>
+                <w:rFonts w:ascii="Segoe UI" w:eastAsia="Segoe UI Light" w:hAnsi="Segoe UI" w:cs="Segoe UI"/>
+                <w:color w:val="333333"/>
+                <w:szCs w:val="52"/>
+              </w:rPr>
+              <w:t>Security roles page is not accessible</w:t>
+            </w:r>
+          </w:p>
+        </w:tc>
+        <w:tc>
+          <w:tcPr>
+            <w:tcW w:w="4513" w:type="dxa"/>
+            <w:shd w:val="clear" w:color="auto" w:fill="FFFFFF"/>
+          </w:tcPr>
+          <w:p>
+            <w:pPr>
+              <w:spacing w:before="200" w:after="100"/>
+              <w:ind w:right="288"/>
+              <w:rPr>
+                <w:rFonts w:ascii="Segoe UI" w:eastAsia="Segoe UI Light" w:hAnsi="Segoe UI" w:cs="Segoe UI"/>
+                <w:color w:val="333333"/>
+                <w:szCs w:val="52"/>
+              </w:rPr>
+            </w:pPr>
+            <w:r>
+              <w:rPr>
+                <w:rFonts w:ascii="Segoe UI" w:eastAsia="Segoe UI Light" w:hAnsi="Segoe UI" w:cs="Segoe UI"/>
+                <w:color w:val="333333"/>
+                <w:szCs w:val="52"/>
+              </w:rPr>
+              <w:t>You need the System Administrator role to manage security roles. Contact your Power Platform admin.</w:t>
+            </w:r>
+          </w:p>
+        </w:tc>
+      </w:tr>
+      <w:tr>
+        <w:tblPrEx>
+          <w:tblCellMar>
+            <w:top w:w="0" w:type="dxa"/>
+            <w:bottom w:w="0" w:type="dxa"/>
+          </w:tblCellMar>
+        </w:tblPrEx>
+        <w:tc>
+          <w:tcPr>
+            <w:tcW w:w="4513" w:type="dxa"/>
+            <w:shd w:val="clear" w:color="auto" w:fill="F5F5F5"/>
+          </w:tcPr>
+          <w:p>
+            <w:pPr>
+              <w:spacing w:before="200" w:after="100"/>
+              <w:ind w:right="288"/>
+              <w:rPr>
+                <w:rFonts w:ascii="Segoe UI" w:eastAsia="Segoe UI Light" w:hAnsi="Segoe UI" w:cs="Segoe UI"/>
+                <w:color w:val="333333"/>
+                <w:szCs w:val="52"/>
+              </w:rPr>
+            </w:pPr>
+            <w:r>
+              <w:rPr>
+                <w:rFonts w:ascii="Segoe UI" w:eastAsia="Segoe UI Light" w:hAnsi="Segoe UI" w:cs="Segoe UI"/>
+                <w:color w:val="333333"/>
+                <w:szCs w:val="52"/>
+              </w:rPr>
+              <w:t>Changes to role don't take effect immediately</w:t>
+            </w:r>
+          </w:p>
+        </w:tc>
+        <w:tc>
+          <w:tcPr>
+            <w:tcW w:w="4513" w:type="dxa"/>
+            <w:shd w:val="clear" w:color="auto" w:fill="F5F5F5"/>
+          </w:tcPr>
+          <w:p>
+            <w:pPr>
+              <w:spacing w:before="200" w:after="100"/>
+              <w:ind w:right="288"/>
+              <w:rPr>
+                <w:rFonts w:ascii="Segoe UI" w:eastAsia="Segoe UI Light" w:hAnsi="Segoe UI" w:cs="Segoe UI"/>
+                <w:color w:val="333333"/>
+                <w:szCs w:val="52"/>
+              </w:rPr>
+            </w:pPr>
+            <w:r>
+              <w:rPr>
+                <w:rFonts w:ascii="Segoe UI" w:eastAsia="Segoe UI Light" w:hAnsi="Segoe UI" w:cs="Segoe UI"/>
+                <w:color w:val="333333"/>
+                <w:szCs w:val="52"/>
+              </w:rPr>
+              <w:t>Security role changes can take up to 15 minutes. Ask the user to sign out and sign back in to Teams, then try again.</w:t>
+            </w:r>
+          </w:p>
+        </w:tc>
+      </w:tr>
+    </w:tbl>
+    <w:p>
+      <w:pPr>
+        <w:shd w:val="clear" w:color="auto" w:fill="FFF4CE"/>
+        <w:spacing w:before="200" w:after="100"/>
+        <w:ind w:left="288" w:right="288"/>
+        <w:rPr>
+          <w:rFonts w:ascii="Segoe UI Semibold" w:eastAsia="Segoe UI Light" w:hAnsi="Segoe UI Semibold" w:cs="Segoe UI Semibold"/>
+          <w:color w:val="8764B8"/>
+          <w:sz w:val="28"/>
+          <w:szCs w:val="52"/>
+        </w:rPr>
+      </w:pPr>
+    </w:p>
+    <w:p>
+      <w:pPr>
+        <w:shd w:val="clear" w:color="auto" w:fill="FFF4CE"/>
+        <w:spacing w:before="200" w:after="100"/>
+        <w:ind w:left="288" w:right="288"/>
+        <w:rPr>
+          <w:rFonts w:ascii="Segoe UI Semibold" w:eastAsia="Segoe UI Light" w:hAnsi="Segoe UI Semibold" w:cs="Segoe UI Semibold"/>
+          <w:color w:val="8764B8"/>
+          <w:sz w:val="28"/>
+          <w:szCs w:val="52"/>
+        </w:rPr>
+      </w:pPr>
+    </w:p>
+    <w:p>
+      <w:pPr>
+        <w:shd w:val="clear" w:color="auto" w:fill="FFF4CE"/>
+        <w:spacing w:before="200" w:after="100"/>
+        <w:ind w:left="288" w:right="288"/>
+        <w:rPr>
+          <w:rFonts w:ascii="Segoe UI Semibold" w:hAnsi="Segoe UI Semibold" w:cs="Segoe UI Semibold"/>
+          <w:color w:val="8764B8"/>
+          <w:sz w:val="28"/>
+        </w:rPr>
+      </w:pPr>
+      <w:r>
+        <w:rPr>
+          <w:rFonts w:ascii="Segoe UI Semibold" w:eastAsia="Segoe UI Light" w:hAnsi="Segoe UI Semibold" w:cs="Segoe UI Semibold"/>
+          <w:color w:val="8764B8"/>
+          <w:sz w:val="28"/>
+          <w:szCs w:val="52"/>
+        </w:rPr>
         <w:t>4. Option B – Publish to Microsoft Teams &amp; Copilot Channels</w:t>
       </w:r>
     </w:p>
@@ -3333,6 +5392,7 @@
           <w:sz w:val="36"/>
           <w:szCs w:val="36"/>
         </w:rPr>
+        <w:lastRenderedPageBreak/>
         <w:t>Step 2: Connect the Teams Channel</w:t>
       </w:r>
     </w:p>
@@ -3569,27 +5629,7 @@
           <w:sz w:val="22"/>
           <w:szCs w:val="22"/>
         </w:rPr>
-        <w:t xml:space="preserve">Developer Information — Enter the </w:t>
-      </w:r>
-      <w:proofErr w:type="gramStart"/>
-      <w:r>
-        <w:rPr>
-          <w:rFonts w:ascii="Segoe UI" w:eastAsia="Segoe UI" w:hAnsi="Segoe UI" w:cs="Segoe UI"/>
-          <w:color w:val="333333"/>
-          <w:sz w:val="22"/>
-          <w:szCs w:val="22"/>
-        </w:rPr>
-        <w:t>developer</w:t>
-      </w:r>
-      <w:proofErr w:type="gramEnd"/>
-      <w:r>
-        <w:rPr>
-          <w:rFonts w:ascii="Segoe UI" w:eastAsia="Segoe UI" w:hAnsi="Segoe UI" w:cs="Segoe UI"/>
-          <w:color w:val="333333"/>
-          <w:sz w:val="22"/>
-          <w:szCs w:val="22"/>
-        </w:rPr>
-        <w:t xml:space="preserve"> name (Power CAT), website, privacy policy URL, and terms of use URL.</w:t>
+        <w:t>Developer Information — Enter the developer name (Power CAT), website, privacy policy URL, and terms of use URL.</w:t>
       </w:r>
     </w:p>
     <w:p>
@@ -3681,27 +5721,7 @@
           <w:sz w:val="22"/>
           <w:szCs w:val="22"/>
         </w:rPr>
-        <w:t xml:space="preserve">Find Microsoft 365 Copilot and toggle it </w:t>
-      </w:r>
-      <w:proofErr w:type="gramStart"/>
-      <w:r>
-        <w:rPr>
-          <w:rFonts w:ascii="Segoe UI" w:eastAsia="Segoe UI" w:hAnsi="Segoe UI" w:cs="Segoe UI"/>
-          <w:color w:val="333333"/>
-          <w:sz w:val="22"/>
-          <w:szCs w:val="22"/>
-        </w:rPr>
-        <w:t>to</w:t>
-      </w:r>
-      <w:proofErr w:type="gramEnd"/>
-      <w:r>
-        <w:rPr>
-          <w:rFonts w:ascii="Segoe UI" w:eastAsia="Segoe UI" w:hAnsi="Segoe UI" w:cs="Segoe UI"/>
-          <w:color w:val="333333"/>
-          <w:sz w:val="22"/>
-          <w:szCs w:val="22"/>
-        </w:rPr>
-        <w:t xml:space="preserve"> On.</w:t>
+        <w:t>Find Microsoft 365 Copilot and toggle it to On.</w:t>
       </w:r>
     </w:p>
     <w:p>
@@ -3729,7 +5749,6 @@
           <w:sz w:val="36"/>
           <w:szCs w:val="36"/>
         </w:rPr>
-        <w:lastRenderedPageBreak/>
         <w:t>Step 3: Install for Yourself First</w:t>
       </w:r>
     </w:p>
@@ -3892,6 +5911,7 @@
           <w:sz w:val="28"/>
           <w:szCs w:val="28"/>
         </w:rPr>
+        <w:lastRenderedPageBreak/>
         <w:t>Method 3: Submit for Admin Approval</w:t>
       </w:r>
     </w:p>
@@ -4222,23 +6242,7 @@
                 <w:rFonts w:ascii="Segoe UI" w:eastAsia="Segoe UI" w:hAnsi="Segoe UI" w:cs="Segoe UI"/>
                 <w:color w:val="333333"/>
               </w:rPr>
-              <w:t xml:space="preserve">Go to </w:t>
-            </w:r>
-            <w:proofErr w:type="gramStart"/>
-            <w:r>
-              <w:rPr>
-                <w:rFonts w:ascii="Segoe UI" w:eastAsia="Segoe UI" w:hAnsi="Segoe UI" w:cs="Segoe UI"/>
-                <w:color w:val="333333"/>
-              </w:rPr>
-              <w:t>m365.cloud.microsoft</w:t>
-            </w:r>
-            <w:proofErr w:type="gramEnd"/>
-            <w:r>
-              <w:rPr>
-                <w:rFonts w:ascii="Segoe UI" w:eastAsia="Segoe UI" w:hAnsi="Segoe UI" w:cs="Segoe UI"/>
-                <w:color w:val="333333"/>
-              </w:rPr>
-              <w:t>/chat → find Request Tracker in the agents panel</w:t>
+              <w:t>Go to m365.cloud.microsoft/chat → find Request Tracker in the agents panel</w:t>
             </w:r>
           </w:p>
         </w:tc>
@@ -4338,7 +6342,6 @@
           <w:sz w:val="22"/>
           <w:szCs w:val="22"/>
         </w:rPr>
-        <w:lastRenderedPageBreak/>
         <w:t xml:space="preserve">3. </w:t>
       </w:r>
       <w:r>
@@ -4564,23 +6567,7 @@
                 <w:rFonts w:ascii="Segoe UI" w:eastAsia="Segoe UI" w:hAnsi="Segoe UI" w:cs="Segoe UI"/>
                 <w:color w:val="333333"/>
               </w:rPr>
-              <w:t xml:space="preserve">Check the visibility toggle in Availability </w:t>
-            </w:r>
-            <w:proofErr w:type="gramStart"/>
-            <w:r>
-              <w:rPr>
-                <w:rFonts w:ascii="Segoe UI" w:eastAsia="Segoe UI" w:hAnsi="Segoe UI" w:cs="Segoe UI"/>
-                <w:color w:val="333333"/>
-              </w:rPr>
-              <w:t>settings, or</w:t>
-            </w:r>
-            <w:proofErr w:type="gramEnd"/>
-            <w:r>
-              <w:rPr>
-                <w:rFonts w:ascii="Segoe UI" w:eastAsia="Segoe UI" w:hAnsi="Segoe UI" w:cs="Segoe UI"/>
-                <w:color w:val="333333"/>
-              </w:rPr>
-              <w:t xml:space="preserve"> submit for admin approval.</w:t>
+              <w:t>Check the visibility toggle in Availability settings, or submit for admin approval.</w:t>
             </w:r>
           </w:p>
         </w:tc>
@@ -4598,21 +6585,12 @@
             </w:tcMar>
           </w:tcPr>
           <w:p>
-            <w:proofErr w:type="spellStart"/>
-            <w:r>
-              <w:rPr>
-                <w:rFonts w:ascii="Segoe UI" w:eastAsia="Segoe UI" w:hAnsi="Segoe UI" w:cs="Segoe UI"/>
-                <w:color w:val="333333"/>
-              </w:rPr>
-              <w:t>SystemError</w:t>
-            </w:r>
-            <w:proofErr w:type="spellEnd"/>
-            <w:r>
-              <w:rPr>
-                <w:rFonts w:ascii="Segoe UI" w:eastAsia="Segoe UI" w:hAnsi="Segoe UI" w:cs="Segoe UI"/>
-                <w:color w:val="333333"/>
-              </w:rPr>
-              <w:t xml:space="preserve"> when chatting</w:t>
+            <w:r>
+              <w:rPr>
+                <w:rFonts w:ascii="Segoe UI" w:eastAsia="Segoe UI" w:hAnsi="Segoe UI" w:cs="Segoe UI"/>
+                <w:color w:val="333333"/>
+              </w:rPr>
+              <w:t>SystemError when chatting</w:t>
             </w:r>
           </w:p>
         </w:tc>
@@ -4699,7 +6677,6 @@
           <w:sz w:val="52"/>
           <w:szCs w:val="52"/>
         </w:rPr>
-        <w:lastRenderedPageBreak/>
         <w:t>5. Option C – Build the Agent from Scratch in Copilot Studio</w:t>
       </w:r>
     </w:p>
@@ -5179,6 +7156,49 @@
     </w:p>
     <w:p>
       <w:pPr>
+        <w:shd w:val="clear" w:color="auto" w:fill="F9E0E0"/>
+        <w:spacing w:before="120" w:after="120"/>
+        <w:ind w:left="288" w:right="288" w:hanging="288"/>
+        <w:rPr>
+          <w:rFonts w:ascii="Segoe UI" w:eastAsia="Segoe UI" w:hAnsi="Segoe UI" w:cs="Segoe UI"/>
+          <w:color w:val="333333"/>
+          <w:sz w:val="22"/>
+          <w:szCs w:val="22"/>
+        </w:rPr>
+      </w:pPr>
+      <w:r>
+        <w:rPr>
+          <w:rFonts w:ascii="Segoe UI Semibold" w:eastAsia="Segoe UI" w:hAnsi="Segoe UI Semibold" w:cs="Segoe UI Semibold"/>
+          <w:color w:val="D13438"/>
+          <w:sz w:val="22"/>
+          <w:szCs w:val="22"/>
+        </w:rPr>
+        <w:t xml:space="preserve">🔴 Important: </w:t>
+      </w:r>
+      <w:r>
+        <w:rPr>
+          <w:rFonts w:ascii="Segoe UI" w:eastAsia="Segoe UI" w:hAnsi="Segoe UI" w:cs="Segoe UI"/>
+          <w:color w:val="333333"/>
+          <w:sz w:val="22"/>
+          <w:szCs w:val="22"/>
+        </w:rPr>
+        <w:t>Before continuing, make sure to configure Dataverse table permissions for your users. Follow the 'Configure Dataverse Table Permissions for Agent Users' steps in Option A above. Without proper security roles, users will not be able to create, read, update, or delete records in the Request Tracker table through the agent.</w:t>
+      </w:r>
+    </w:p>
+    <w:p>
+      <w:pPr>
+        <w:spacing w:after="50"/>
+        <w:ind w:left="576" w:hanging="288"/>
+        <w:rPr>
+          <w:rFonts w:ascii="Segoe UI" w:eastAsia="Segoe UI" w:hAnsi="Segoe UI" w:cs="Segoe UI"/>
+          <w:color w:val="333333"/>
+          <w:sz w:val="22"/>
+          <w:szCs w:val="22"/>
+        </w:rPr>
+      </w:pPr>
+    </w:p>
+    <w:p>
+      <w:pPr>
         <w:spacing w:after="50"/>
         <w:ind w:left="576" w:hanging="288"/>
       </w:pPr>
@@ -5412,7 +7432,6 @@
           <w:sz w:val="36"/>
           <w:szCs w:val="36"/>
         </w:rPr>
-        <w:lastRenderedPageBreak/>
         <w:t>Part 2: Configure Agent Settings &amp; Instructions</w:t>
       </w:r>
     </w:p>
@@ -5654,67 +7673,7 @@
           <w:sz w:val="17"/>
           <w:szCs w:val="17"/>
         </w:rPr>
-        <w:t>You are the **Request Tracker Assistant**, a helpful and friendly agent that helps users manage requests stored in the _</w:t>
-      </w:r>
-      <w:proofErr w:type="spellStart"/>
-      <w:r>
-        <w:rPr>
-          <w:rFonts w:ascii="Consolas" w:eastAsia="Consolas" w:hAnsi="Consolas" w:cs="Consolas"/>
-          <w:color w:val="333333"/>
-          <w:sz w:val="17"/>
-          <w:szCs w:val="17"/>
-        </w:rPr>
-        <w:t>RequestTracker</w:t>
-      </w:r>
-      <w:proofErr w:type="spellEnd"/>
-      <w:r>
-        <w:rPr>
-          <w:rFonts w:ascii="Consolas" w:eastAsia="Consolas" w:hAnsi="Consolas" w:cs="Consolas"/>
-          <w:color w:val="333333"/>
-          <w:sz w:val="17"/>
-          <w:szCs w:val="17"/>
-        </w:rPr>
-        <w:t xml:space="preserve"> Dataverse table. You support searching, analyzing, creating, and updating request records. Today's date is {</w:t>
-      </w:r>
-      <w:proofErr w:type="gramStart"/>
-      <w:r>
-        <w:rPr>
-          <w:rFonts w:ascii="Consolas" w:eastAsia="Consolas" w:hAnsi="Consolas" w:cs="Consolas"/>
-          <w:color w:val="333333"/>
-          <w:sz w:val="17"/>
-          <w:szCs w:val="17"/>
-        </w:rPr>
-        <w:t>Today(</w:t>
-      </w:r>
-      <w:proofErr w:type="gramEnd"/>
-      <w:r>
-        <w:rPr>
-          <w:rFonts w:ascii="Consolas" w:eastAsia="Consolas" w:hAnsi="Consolas" w:cs="Consolas"/>
-          <w:color w:val="333333"/>
-          <w:sz w:val="17"/>
-          <w:szCs w:val="17"/>
-        </w:rPr>
-        <w:t xml:space="preserve">)}. Use it when answering questions about deadlines, due dates, or anything </w:t>
-      </w:r>
-      <w:proofErr w:type="gramStart"/>
-      <w:r>
-        <w:rPr>
-          <w:rFonts w:ascii="Consolas" w:eastAsia="Consolas" w:hAnsi="Consolas" w:cs="Consolas"/>
-          <w:color w:val="333333"/>
-          <w:sz w:val="17"/>
-          <w:szCs w:val="17"/>
-        </w:rPr>
-        <w:t>time-sensitive</w:t>
-      </w:r>
-      <w:proofErr w:type="gramEnd"/>
-      <w:r>
-        <w:rPr>
-          <w:rFonts w:ascii="Consolas" w:eastAsia="Consolas" w:hAnsi="Consolas" w:cs="Consolas"/>
-          <w:color w:val="333333"/>
-          <w:sz w:val="17"/>
-          <w:szCs w:val="17"/>
-        </w:rPr>
-        <w:t>.</w:t>
+        <w:t>You are the **Request Tracker Assistant**, a helpful and friendly agent that helps users manage requests stored in the _RequestTracker Dataverse table. You support searching, analyzing, creating, and updating request records. Today's date is {Today()}. Use it when answering questions about deadlines, due dates, or anything time-sensitive.</w:t>
       </w:r>
     </w:p>
     <w:p>
@@ -5904,27 +7863,7 @@
           <w:sz w:val="17"/>
           <w:szCs w:val="17"/>
         </w:rPr>
-        <w:t xml:space="preserve"> - **🔍 Search &amp; Query Requests** — Find, filter, and analyze requests by keywords, status, priority, assignee, date, or any combination. You handle all search and query operations conversationally using your _</w:t>
-      </w:r>
-      <w:proofErr w:type="spellStart"/>
-      <w:r>
-        <w:rPr>
-          <w:rFonts w:ascii="Consolas" w:eastAsia="Consolas" w:hAnsi="Consolas" w:cs="Consolas"/>
-          <w:color w:val="333333"/>
-          <w:sz w:val="17"/>
-          <w:szCs w:val="17"/>
-        </w:rPr>
-        <w:t>RequestTracker</w:t>
-      </w:r>
-      <w:proofErr w:type="spellEnd"/>
-      <w:r>
-        <w:rPr>
-          <w:rFonts w:ascii="Consolas" w:eastAsia="Consolas" w:hAnsi="Consolas" w:cs="Consolas"/>
-          <w:color w:val="333333"/>
-          <w:sz w:val="17"/>
-          <w:szCs w:val="17"/>
-        </w:rPr>
-        <w:t xml:space="preserve"> knowledge source.</w:t>
+        <w:t xml:space="preserve"> - **🔍 Search &amp; Query Requests** — Find, filter, and analyze requests by keywords, status, priority, assignee, date, or any combination. You handle all search and query operations conversationally using your _RequestTracker knowledge source.</w:t>
       </w:r>
     </w:p>
     <w:p>
@@ -6038,27 +7977,7 @@
           <w:sz w:val="17"/>
           <w:szCs w:val="17"/>
         </w:rPr>
-        <w:t>You have direct access to the _</w:t>
-      </w:r>
-      <w:proofErr w:type="spellStart"/>
-      <w:r>
-        <w:rPr>
-          <w:rFonts w:ascii="Consolas" w:eastAsia="Consolas" w:hAnsi="Consolas" w:cs="Consolas"/>
-          <w:color w:val="333333"/>
-          <w:sz w:val="17"/>
-          <w:szCs w:val="17"/>
-        </w:rPr>
-        <w:t>RequestTracker</w:t>
-      </w:r>
-      <w:proofErr w:type="spellEnd"/>
-      <w:r>
-        <w:rPr>
-          <w:rFonts w:ascii="Consolas" w:eastAsia="Consolas" w:hAnsi="Consolas" w:cs="Consolas"/>
-          <w:color w:val="333333"/>
-          <w:sz w:val="17"/>
-          <w:szCs w:val="17"/>
-        </w:rPr>
-        <w:t xml:space="preserve"> Dataverse knowledge source. When users ask to search, query, filter, or analyze requests:</w:t>
+        <w:t>You have direct access to the _RequestTracker Dataverse knowledge source. When users ask to search, query, filter, or analyze requests:</w:t>
       </w:r>
     </w:p>
     <w:p>
@@ -6305,7 +8224,6 @@
           <w:sz w:val="17"/>
           <w:szCs w:val="17"/>
         </w:rPr>
-        <w:lastRenderedPageBreak/>
         <w:t xml:space="preserve"> - **Assigned To** — The person or team responsible for fulfilling the request</w:t>
       </w:r>
     </w:p>
@@ -6857,27 +8775,7 @@
           <w:sz w:val="17"/>
           <w:szCs w:val="17"/>
         </w:rPr>
-        <w:t xml:space="preserve"> - **Search &amp; Query — No topic needed** — When the user asks to search, find, list, filter, count, summarize, or analyze requests, do NOT route to any topic. Answer directly from the _</w:t>
-      </w:r>
-      <w:proofErr w:type="spellStart"/>
-      <w:r>
-        <w:rPr>
-          <w:rFonts w:ascii="Consolas" w:eastAsia="Consolas" w:hAnsi="Consolas" w:cs="Consolas"/>
-          <w:color w:val="333333"/>
-          <w:sz w:val="17"/>
-          <w:szCs w:val="17"/>
-        </w:rPr>
-        <w:t>RequestTracker</w:t>
-      </w:r>
-      <w:proofErr w:type="spellEnd"/>
-      <w:r>
-        <w:rPr>
-          <w:rFonts w:ascii="Consolas" w:eastAsia="Consolas" w:hAnsi="Consolas" w:cs="Consolas"/>
-          <w:color w:val="333333"/>
-          <w:sz w:val="17"/>
-          <w:szCs w:val="17"/>
-        </w:rPr>
-        <w:t xml:space="preserve"> knowledge source using conversational generative answers.</w:t>
+        <w:t xml:space="preserve"> - **Search &amp; Query — No topic needed** — When the user asks to search, find, list, filter, count, summarize, or analyze requests, do NOT route to any topic. Answer directly from the _RequestTracker knowledge source using conversational generative answers.</w:t>
       </w:r>
     </w:p>
     <w:p>
@@ -6896,27 +8794,7 @@
           <w:sz w:val="17"/>
           <w:szCs w:val="17"/>
         </w:rPr>
-        <w:t xml:space="preserve"> - **Sample Data — Admin only** — Only route to the Populate Sample Data topic when the user explicitly </w:t>
-      </w:r>
-      <w:proofErr w:type="gramStart"/>
-      <w:r>
-        <w:rPr>
-          <w:rFonts w:ascii="Consolas" w:eastAsia="Consolas" w:hAnsi="Consolas" w:cs="Consolas"/>
-          <w:color w:val="333333"/>
-          <w:sz w:val="17"/>
-          <w:szCs w:val="17"/>
-        </w:rPr>
-        <w:t>says</w:t>
-      </w:r>
-      <w:proofErr w:type="gramEnd"/>
-      <w:r>
-        <w:rPr>
-          <w:rFonts w:ascii="Consolas" w:eastAsia="Consolas" w:hAnsi="Consolas" w:cs="Consolas"/>
-          <w:color w:val="333333"/>
-          <w:sz w:val="17"/>
-          <w:szCs w:val="17"/>
-        </w:rPr>
-        <w:t xml:space="preserve"> "sample data", "test data", or "populate data" in the context of bulk-loading demo records. A request like "add a new request" is NOT sample data — that is a single new request.</w:t>
+        <w:t xml:space="preserve"> - **Sample Data — Admin only** — Only route to the Populate Sample Data topic when the user explicitly says "sample data", "test data", or "populate data" in the context of bulk-loading demo records. A request like "add a new request" is NOT sample data — that is a single new request.</w:t>
       </w:r>
     </w:p>
     <w:p>
@@ -6992,29 +8870,7 @@
           <w:sz w:val="17"/>
           <w:szCs w:val="17"/>
         </w:rPr>
-        <w:t>The current signed-in user's human-readable name is **{</w:t>
-      </w:r>
-      <w:proofErr w:type="spellStart"/>
-      <w:proofErr w:type="gramStart"/>
-      <w:r>
-        <w:rPr>
-          <w:rFonts w:ascii="Consolas" w:eastAsia="Consolas" w:hAnsi="Consolas" w:cs="Consolas"/>
-          <w:color w:val="333333"/>
-          <w:sz w:val="17"/>
-          <w:szCs w:val="17"/>
-        </w:rPr>
-        <w:t>System.User.DisplayName</w:t>
-      </w:r>
-      <w:proofErr w:type="spellEnd"/>
-      <w:proofErr w:type="gramEnd"/>
-      <w:r>
-        <w:rPr>
-          <w:rFonts w:ascii="Consolas" w:eastAsia="Consolas" w:hAnsi="Consolas" w:cs="Consolas"/>
-          <w:color w:val="333333"/>
-          <w:sz w:val="17"/>
-          <w:szCs w:val="17"/>
-        </w:rPr>
-        <w:t>}** (e.g., "Matt Krause"). This is the display name — a real person's name, not a GUID or internal ID.</w:t>
+        <w:t>The current signed-in user's human-readable name is **{System.User.DisplayName}** (e.g., "Matt Krause"). This is the display name — a real person's name, not a GUID or internal ID.</w:t>
       </w:r>
     </w:p>
     <w:p>
@@ -7052,51 +8908,7 @@
           <w:sz w:val="17"/>
           <w:szCs w:val="17"/>
         </w:rPr>
-        <w:t xml:space="preserve">### </w:t>
-      </w:r>
-      <w:proofErr w:type="spellStart"/>
-      <w:proofErr w:type="gramStart"/>
-      <w:r>
-        <w:rPr>
-          <w:rFonts w:ascii="Consolas" w:eastAsia="Consolas" w:hAnsi="Consolas" w:cs="Consolas"/>
-          <w:color w:val="333333"/>
-          <w:sz w:val="17"/>
-          <w:szCs w:val="17"/>
-        </w:rPr>
-        <w:t>System.User.DisplayName</w:t>
-      </w:r>
-      <w:proofErr w:type="spellEnd"/>
-      <w:proofErr w:type="gramEnd"/>
-      <w:r>
-        <w:rPr>
-          <w:rFonts w:ascii="Consolas" w:eastAsia="Consolas" w:hAnsi="Consolas" w:cs="Consolas"/>
-          <w:color w:val="333333"/>
-          <w:sz w:val="17"/>
-          <w:szCs w:val="17"/>
-        </w:rPr>
-        <w:t xml:space="preserve"> vs </w:t>
-      </w:r>
-      <w:proofErr w:type="spellStart"/>
-      <w:proofErr w:type="gramStart"/>
-      <w:r>
-        <w:rPr>
-          <w:rFonts w:ascii="Consolas" w:eastAsia="Consolas" w:hAnsi="Consolas" w:cs="Consolas"/>
-          <w:color w:val="333333"/>
-          <w:sz w:val="17"/>
-          <w:szCs w:val="17"/>
-        </w:rPr>
-        <w:t>System.User.Id</w:t>
-      </w:r>
-      <w:proofErr w:type="spellEnd"/>
-      <w:proofErr w:type="gramEnd"/>
-      <w:r>
-        <w:rPr>
-          <w:rFonts w:ascii="Consolas" w:eastAsia="Consolas" w:hAnsi="Consolas" w:cs="Consolas"/>
-          <w:color w:val="333333"/>
-          <w:sz w:val="17"/>
-          <w:szCs w:val="17"/>
-        </w:rPr>
-        <w:t xml:space="preserve"> — CRITICAL distinction:</w:t>
+        <w:t>### System.User.DisplayName vs System.User.Id — CRITICAL distinction:</w:t>
       </w:r>
     </w:p>
     <w:p>
@@ -7115,29 +8927,7 @@
           <w:sz w:val="17"/>
           <w:szCs w:val="17"/>
         </w:rPr>
-        <w:t xml:space="preserve"> - **{</w:t>
-      </w:r>
-      <w:proofErr w:type="spellStart"/>
-      <w:proofErr w:type="gramStart"/>
-      <w:r>
-        <w:rPr>
-          <w:rFonts w:ascii="Consolas" w:eastAsia="Consolas" w:hAnsi="Consolas" w:cs="Consolas"/>
-          <w:color w:val="333333"/>
-          <w:sz w:val="17"/>
-          <w:szCs w:val="17"/>
-        </w:rPr>
-        <w:t>System.User.DisplayName</w:t>
-      </w:r>
-      <w:proofErr w:type="spellEnd"/>
-      <w:proofErr w:type="gramEnd"/>
-      <w:r>
-        <w:rPr>
-          <w:rFonts w:ascii="Consolas" w:eastAsia="Consolas" w:hAnsi="Consolas" w:cs="Consolas"/>
-          <w:color w:val="333333"/>
-          <w:sz w:val="17"/>
-          <w:szCs w:val="17"/>
-        </w:rPr>
-        <w:t>}** = the user's human-readable name (e.g., "Matt Krause"). Use this for ALL user-facing responses, name matching, and search filters.</w:t>
+        <w:t xml:space="preserve"> - **{System.User.DisplayName}** = the user's human-readable name (e.g., "Matt Krause"). Use this for ALL user-facing responses, name matching, and search filters.</w:t>
       </w:r>
     </w:p>
     <w:p>
@@ -7156,49 +8946,7 @@
           <w:sz w:val="17"/>
           <w:szCs w:val="17"/>
         </w:rPr>
-        <w:t xml:space="preserve"> - **{</w:t>
-      </w:r>
-      <w:proofErr w:type="spellStart"/>
-      <w:proofErr w:type="gramStart"/>
-      <w:r>
-        <w:rPr>
-          <w:rFonts w:ascii="Consolas" w:eastAsia="Consolas" w:hAnsi="Consolas" w:cs="Consolas"/>
-          <w:color w:val="333333"/>
-          <w:sz w:val="17"/>
-          <w:szCs w:val="17"/>
-        </w:rPr>
-        <w:t>System.User.Id</w:t>
-      </w:r>
-      <w:proofErr w:type="spellEnd"/>
-      <w:proofErr w:type="gramEnd"/>
-      <w:r>
-        <w:rPr>
-          <w:rFonts w:ascii="Consolas" w:eastAsia="Consolas" w:hAnsi="Consolas" w:cs="Consolas"/>
-          <w:color w:val="333333"/>
-          <w:sz w:val="17"/>
-          <w:szCs w:val="17"/>
-        </w:rPr>
-        <w:t xml:space="preserve">}** = an internal GUID (e.g., "a1b2c3d4-..."). NEVER display this to the user. NEVER use it for name matching or filtering by name fields. NEVER return it when the user </w:t>
-      </w:r>
-      <w:proofErr w:type="gramStart"/>
-      <w:r>
-        <w:rPr>
-          <w:rFonts w:ascii="Consolas" w:eastAsia="Consolas" w:hAnsi="Consolas" w:cs="Consolas"/>
-          <w:color w:val="333333"/>
-          <w:sz w:val="17"/>
-          <w:szCs w:val="17"/>
-        </w:rPr>
-        <w:t>asks</w:t>
-      </w:r>
-      <w:proofErr w:type="gramEnd"/>
-      <w:r>
-        <w:rPr>
-          <w:rFonts w:ascii="Consolas" w:eastAsia="Consolas" w:hAnsi="Consolas" w:cs="Consolas"/>
-          <w:color w:val="333333"/>
-          <w:sz w:val="17"/>
-          <w:szCs w:val="17"/>
-        </w:rPr>
-        <w:t xml:space="preserve"> "who am I?"</w:t>
+        <w:t xml:space="preserve"> - **{System.User.Id}** = an internal GUID (e.g., "a1b2c3d4-..."). NEVER display this to the user. NEVER use it for name matching or filtering by name fields. NEVER return it when the user asks "who am I?"</w:t>
       </w:r>
     </w:p>
     <w:p>
@@ -7255,72 +9003,7 @@
           <w:sz w:val="17"/>
           <w:szCs w:val="17"/>
         </w:rPr>
-        <w:lastRenderedPageBreak/>
-        <w:t xml:space="preserve">When the user </w:t>
-      </w:r>
-      <w:proofErr w:type="gramStart"/>
-      <w:r>
-        <w:rPr>
-          <w:rFonts w:ascii="Consolas" w:eastAsia="Consolas" w:hAnsi="Consolas" w:cs="Consolas"/>
-          <w:color w:val="333333"/>
-          <w:sz w:val="17"/>
-          <w:szCs w:val="17"/>
-        </w:rPr>
-        <w:t>asks</w:t>
-      </w:r>
-      <w:proofErr w:type="gramEnd"/>
-      <w:r>
-        <w:rPr>
-          <w:rFonts w:ascii="Consolas" w:eastAsia="Consolas" w:hAnsi="Consolas" w:cs="Consolas"/>
-          <w:color w:val="333333"/>
-          <w:sz w:val="17"/>
-          <w:szCs w:val="17"/>
-        </w:rPr>
-        <w:t xml:space="preserve"> "who am I?", "what's my name?", or any identity question, ALWAYS respond with their display name: "You are {</w:t>
-      </w:r>
-      <w:proofErr w:type="spellStart"/>
-      <w:proofErr w:type="gramStart"/>
-      <w:r>
-        <w:rPr>
-          <w:rFonts w:ascii="Consolas" w:eastAsia="Consolas" w:hAnsi="Consolas" w:cs="Consolas"/>
-          <w:color w:val="333333"/>
-          <w:sz w:val="17"/>
-          <w:szCs w:val="17"/>
-        </w:rPr>
-        <w:t>System.User.DisplayName</w:t>
-      </w:r>
-      <w:proofErr w:type="spellEnd"/>
-      <w:proofErr w:type="gramEnd"/>
-      <w:r>
-        <w:rPr>
-          <w:rFonts w:ascii="Consolas" w:eastAsia="Consolas" w:hAnsi="Consolas" w:cs="Consolas"/>
-          <w:color w:val="333333"/>
-          <w:sz w:val="17"/>
-          <w:szCs w:val="17"/>
-        </w:rPr>
-        <w:t xml:space="preserve">}." Never respond with a GUID, </w:t>
-      </w:r>
-      <w:proofErr w:type="spellStart"/>
-      <w:proofErr w:type="gramStart"/>
-      <w:r>
-        <w:rPr>
-          <w:rFonts w:ascii="Consolas" w:eastAsia="Consolas" w:hAnsi="Consolas" w:cs="Consolas"/>
-          <w:color w:val="333333"/>
-          <w:sz w:val="17"/>
-          <w:szCs w:val="17"/>
-        </w:rPr>
-        <w:t>System.User.Id</w:t>
-      </w:r>
-      <w:proofErr w:type="spellEnd"/>
-      <w:proofErr w:type="gramEnd"/>
-      <w:r>
-        <w:rPr>
-          <w:rFonts w:ascii="Consolas" w:eastAsia="Consolas" w:hAnsi="Consolas" w:cs="Consolas"/>
-          <w:color w:val="333333"/>
-          <w:sz w:val="17"/>
-          <w:szCs w:val="17"/>
-        </w:rPr>
-        <w:t>, or any internal identifier.</w:t>
+        <w:t>When the user asks "who am I?", "what's my name?", or any identity question, ALWAYS respond with their display name: "You are {System.User.DisplayName}." Never respond with a GUID, System.User.Id, or any internal identifier.</w:t>
       </w:r>
     </w:p>
     <w:p>
@@ -7377,29 +9060,7 @@
           <w:sz w:val="17"/>
           <w:szCs w:val="17"/>
         </w:rPr>
-        <w:t>Whenever the user uses first-person pronouns ("my", "I", "me", "mine") in any request context — creating, searching, updating, or describing requests — ALWAYS resolve those pronouns to **{</w:t>
-      </w:r>
-      <w:proofErr w:type="spellStart"/>
-      <w:proofErr w:type="gramStart"/>
-      <w:r>
-        <w:rPr>
-          <w:rFonts w:ascii="Consolas" w:eastAsia="Consolas" w:hAnsi="Consolas" w:cs="Consolas"/>
-          <w:color w:val="333333"/>
-          <w:sz w:val="17"/>
-          <w:szCs w:val="17"/>
-        </w:rPr>
-        <w:t>System.User.DisplayName</w:t>
-      </w:r>
-      <w:proofErr w:type="spellEnd"/>
-      <w:proofErr w:type="gramEnd"/>
-      <w:r>
-        <w:rPr>
-          <w:rFonts w:ascii="Consolas" w:eastAsia="Consolas" w:hAnsi="Consolas" w:cs="Consolas"/>
-          <w:color w:val="333333"/>
-          <w:sz w:val="17"/>
-          <w:szCs w:val="17"/>
-        </w:rPr>
-        <w:t>}**. Examples:</w:t>
+        <w:t>Whenever the user uses first-person pronouns ("my", "I", "me", "mine") in any request context — creating, searching, updating, or describing requests — ALWAYS resolve those pronouns to **{System.User.DisplayName}**. Examples:</w:t>
       </w:r>
     </w:p>
     <w:p>
@@ -7418,29 +9079,7 @@
           <w:sz w:val="17"/>
           <w:szCs w:val="17"/>
         </w:rPr>
-        <w:t xml:space="preserve"> - "move my desk" → title becomes "Move {</w:t>
-      </w:r>
-      <w:proofErr w:type="spellStart"/>
-      <w:proofErr w:type="gramStart"/>
-      <w:r>
-        <w:rPr>
-          <w:rFonts w:ascii="Consolas" w:eastAsia="Consolas" w:hAnsi="Consolas" w:cs="Consolas"/>
-          <w:color w:val="333333"/>
-          <w:sz w:val="17"/>
-          <w:szCs w:val="17"/>
-        </w:rPr>
-        <w:t>System.User.DisplayName</w:t>
-      </w:r>
-      <w:proofErr w:type="spellEnd"/>
-      <w:proofErr w:type="gramEnd"/>
-      <w:r>
-        <w:rPr>
-          <w:rFonts w:ascii="Consolas" w:eastAsia="Consolas" w:hAnsi="Consolas" w:cs="Consolas"/>
-          <w:color w:val="333333"/>
-          <w:sz w:val="17"/>
-          <w:szCs w:val="17"/>
-        </w:rPr>
-        <w:t>}'s desk"</w:t>
+        <w:t xml:space="preserve"> - "move my desk" → title becomes "Move {System.User.DisplayName}'s desk"</w:t>
       </w:r>
     </w:p>
     <w:p>
@@ -7459,29 +9098,7 @@
           <w:sz w:val="17"/>
           <w:szCs w:val="17"/>
         </w:rPr>
-        <w:t xml:space="preserve"> - "I need a new laptop" → title becomes "{</w:t>
-      </w:r>
-      <w:proofErr w:type="spellStart"/>
-      <w:proofErr w:type="gramStart"/>
-      <w:r>
-        <w:rPr>
-          <w:rFonts w:ascii="Consolas" w:eastAsia="Consolas" w:hAnsi="Consolas" w:cs="Consolas"/>
-          <w:color w:val="333333"/>
-          <w:sz w:val="17"/>
-          <w:szCs w:val="17"/>
-        </w:rPr>
-        <w:t>System.User.DisplayName</w:t>
-      </w:r>
-      <w:proofErr w:type="spellEnd"/>
-      <w:proofErr w:type="gramEnd"/>
-      <w:r>
-        <w:rPr>
-          <w:rFonts w:ascii="Consolas" w:eastAsia="Consolas" w:hAnsi="Consolas" w:cs="Consolas"/>
-          <w:color w:val="333333"/>
-          <w:sz w:val="17"/>
-          <w:szCs w:val="17"/>
-        </w:rPr>
-        <w:t>} needs a new laptop"</w:t>
+        <w:t xml:space="preserve"> - "I need a new laptop" → title becomes "{System.User.DisplayName} needs a new laptop"</w:t>
       </w:r>
     </w:p>
     <w:p>
@@ -7500,29 +9117,7 @@
           <w:sz w:val="17"/>
           <w:szCs w:val="17"/>
         </w:rPr>
-        <w:t xml:space="preserve"> - "update my request" → search for requests where the Requestor or Title references {</w:t>
-      </w:r>
-      <w:proofErr w:type="spellStart"/>
-      <w:proofErr w:type="gramStart"/>
-      <w:r>
-        <w:rPr>
-          <w:rFonts w:ascii="Consolas" w:eastAsia="Consolas" w:hAnsi="Consolas" w:cs="Consolas"/>
-          <w:color w:val="333333"/>
-          <w:sz w:val="17"/>
-          <w:szCs w:val="17"/>
-        </w:rPr>
-        <w:t>System.User.DisplayName</w:t>
-      </w:r>
-      <w:proofErr w:type="spellEnd"/>
-      <w:proofErr w:type="gramEnd"/>
-      <w:r>
-        <w:rPr>
-          <w:rFonts w:ascii="Consolas" w:eastAsia="Consolas" w:hAnsi="Consolas" w:cs="Consolas"/>
-          <w:color w:val="333333"/>
-          <w:sz w:val="17"/>
-          <w:szCs w:val="17"/>
-        </w:rPr>
-        <w:t>}</w:t>
+        <w:t xml:space="preserve"> - "update my request" → search for requests where the Requestor or Title references {System.User.DisplayName}</w:t>
       </w:r>
     </w:p>
     <w:p>
@@ -7617,29 +9212,7 @@
           <w:sz w:val="17"/>
           <w:szCs w:val="17"/>
         </w:rPr>
-        <w:t xml:space="preserve"> - Resolve "me" / "my" to **{</w:t>
-      </w:r>
-      <w:proofErr w:type="spellStart"/>
-      <w:proofErr w:type="gramStart"/>
-      <w:r>
-        <w:rPr>
-          <w:rFonts w:ascii="Consolas" w:eastAsia="Consolas" w:hAnsi="Consolas" w:cs="Consolas"/>
-          <w:color w:val="333333"/>
-          <w:sz w:val="17"/>
-          <w:szCs w:val="17"/>
-        </w:rPr>
-        <w:t>System.User.DisplayName</w:t>
-      </w:r>
-      <w:proofErr w:type="spellEnd"/>
-      <w:proofErr w:type="gramEnd"/>
-      <w:r>
-        <w:rPr>
-          <w:rFonts w:ascii="Consolas" w:eastAsia="Consolas" w:hAnsi="Consolas" w:cs="Consolas"/>
-          <w:color w:val="333333"/>
-          <w:sz w:val="17"/>
-          <w:szCs w:val="17"/>
-        </w:rPr>
-        <w:t>}** (the human-readable name, NOT the GUID).</w:t>
+        <w:t xml:space="preserve"> - Resolve "me" / "my" to **{System.User.DisplayName}** (the human-readable name, NOT the GUID).</w:t>
       </w:r>
     </w:p>
     <w:p>
@@ -7658,29 +9231,7 @@
           <w:sz w:val="17"/>
           <w:szCs w:val="17"/>
         </w:rPr>
-        <w:t xml:space="preserve"> - Filter the **Assigned To** field by matching against **{</w:t>
-      </w:r>
-      <w:proofErr w:type="spellStart"/>
-      <w:proofErr w:type="gramStart"/>
-      <w:r>
-        <w:rPr>
-          <w:rFonts w:ascii="Consolas" w:eastAsia="Consolas" w:hAnsi="Consolas" w:cs="Consolas"/>
-          <w:color w:val="333333"/>
-          <w:sz w:val="17"/>
-          <w:szCs w:val="17"/>
-        </w:rPr>
-        <w:t>System.User.DisplayName</w:t>
-      </w:r>
-      <w:proofErr w:type="spellEnd"/>
-      <w:proofErr w:type="gramEnd"/>
-      <w:r>
-        <w:rPr>
-          <w:rFonts w:ascii="Consolas" w:eastAsia="Consolas" w:hAnsi="Consolas" w:cs="Consolas"/>
-          <w:color w:val="333333"/>
-          <w:sz w:val="17"/>
-          <w:szCs w:val="17"/>
-        </w:rPr>
-        <w:t>}**.</w:t>
+        <w:t xml:space="preserve"> - Filter the **Assigned To** field by matching against **{System.User.DisplayName}**.</w:t>
       </w:r>
     </w:p>
     <w:p>
@@ -7699,29 +9250,7 @@
           <w:sz w:val="17"/>
           <w:szCs w:val="17"/>
         </w:rPr>
-        <w:t xml:space="preserve"> - Similarly, when searching for requests the user submitted, filter the **Requestor** field against **{</w:t>
-      </w:r>
-      <w:proofErr w:type="spellStart"/>
-      <w:proofErr w:type="gramStart"/>
-      <w:r>
-        <w:rPr>
-          <w:rFonts w:ascii="Consolas" w:eastAsia="Consolas" w:hAnsi="Consolas" w:cs="Consolas"/>
-          <w:color w:val="333333"/>
-          <w:sz w:val="17"/>
-          <w:szCs w:val="17"/>
-        </w:rPr>
-        <w:t>System.User.DisplayName</w:t>
-      </w:r>
-      <w:proofErr w:type="spellEnd"/>
-      <w:proofErr w:type="gramEnd"/>
-      <w:r>
-        <w:rPr>
-          <w:rFonts w:ascii="Consolas" w:eastAsia="Consolas" w:hAnsi="Consolas" w:cs="Consolas"/>
-          <w:color w:val="333333"/>
-          <w:sz w:val="17"/>
-          <w:szCs w:val="17"/>
-        </w:rPr>
-        <w:t>}**.</w:t>
+        <w:t xml:space="preserve"> - Similarly, when searching for requests the user submitted, filter the **Requestor** field against **{System.User.DisplayName}**.</w:t>
       </w:r>
     </w:p>
     <w:p>
@@ -7740,49 +9269,7 @@
           <w:sz w:val="17"/>
           <w:szCs w:val="17"/>
         </w:rPr>
-        <w:t xml:space="preserve"> - NEVER filter by </w:t>
-      </w:r>
-      <w:proofErr w:type="spellStart"/>
-      <w:proofErr w:type="gramStart"/>
-      <w:r>
-        <w:rPr>
-          <w:rFonts w:ascii="Consolas" w:eastAsia="Consolas" w:hAnsi="Consolas" w:cs="Consolas"/>
-          <w:color w:val="333333"/>
-          <w:sz w:val="17"/>
-          <w:szCs w:val="17"/>
-        </w:rPr>
-        <w:t>System.User.Id</w:t>
-      </w:r>
-      <w:proofErr w:type="spellEnd"/>
-      <w:proofErr w:type="gramEnd"/>
-      <w:r>
-        <w:rPr>
-          <w:rFonts w:ascii="Consolas" w:eastAsia="Consolas" w:hAnsi="Consolas" w:cs="Consolas"/>
-          <w:color w:val="333333"/>
-          <w:sz w:val="17"/>
-          <w:szCs w:val="17"/>
-        </w:rPr>
-        <w:t xml:space="preserve"> or any GUID when matching name-based fields like Assigned </w:t>
-      </w:r>
-      <w:proofErr w:type="gramStart"/>
-      <w:r>
-        <w:rPr>
-          <w:rFonts w:ascii="Consolas" w:eastAsia="Consolas" w:hAnsi="Consolas" w:cs="Consolas"/>
-          <w:color w:val="333333"/>
-          <w:sz w:val="17"/>
-          <w:szCs w:val="17"/>
-        </w:rPr>
-        <w:t>To</w:t>
-      </w:r>
-      <w:proofErr w:type="gramEnd"/>
-      <w:r>
-        <w:rPr>
-          <w:rFonts w:ascii="Consolas" w:eastAsia="Consolas" w:hAnsi="Consolas" w:cs="Consolas"/>
-          <w:color w:val="333333"/>
-          <w:sz w:val="17"/>
-          <w:szCs w:val="17"/>
-        </w:rPr>
-        <w:t xml:space="preserve"> or Requestor.</w:t>
+        <w:t xml:space="preserve"> - NEVER filter by System.User.Id or any GUID when matching name-based fields like Assigned To or Requestor.</w:t>
       </w:r>
     </w:p>
     <w:p>
@@ -8000,27 +9487,7 @@
           <w:sz w:val="22"/>
           <w:szCs w:val="22"/>
         </w:rPr>
-        <w:t>Select all the text in the box above (</w:t>
-      </w:r>
-      <w:proofErr w:type="spellStart"/>
-      <w:r>
-        <w:rPr>
-          <w:rFonts w:ascii="Segoe UI" w:eastAsia="Segoe UI" w:hAnsi="Segoe UI" w:cs="Segoe UI"/>
-          <w:color w:val="333333"/>
-          <w:sz w:val="22"/>
-          <w:szCs w:val="22"/>
-        </w:rPr>
-        <w:t>Ctrl+A</w:t>
-      </w:r>
-      <w:proofErr w:type="spellEnd"/>
-      <w:r>
-        <w:rPr>
-          <w:rFonts w:ascii="Segoe UI" w:eastAsia="Segoe UI" w:hAnsi="Segoe UI" w:cs="Segoe UI"/>
-          <w:color w:val="333333"/>
-          <w:sz w:val="22"/>
-          <w:szCs w:val="22"/>
-        </w:rPr>
-        <w:t xml:space="preserve"> after clicking inside) and paste it directly into the Instructions field. The markdown formatting will be preserved.</w:t>
+        <w:t>Select all the text in the box above (Ctrl+A after clicking inside) and paste it directly into the Instructions field. The markdown formatting will be preserved.</w:t>
       </w:r>
     </w:p>
     <w:p>
@@ -8425,7 +9892,6 @@
                 <w:rFonts w:ascii="Segoe UI" w:eastAsia="Segoe UI" w:hAnsi="Segoe UI" w:cs="Segoe UI"/>
                 <w:color w:val="333333"/>
               </w:rPr>
-              <w:lastRenderedPageBreak/>
               <w:t>General Knowledge</w:t>
             </w:r>
           </w:p>
@@ -8882,27 +10348,7 @@
           <w:sz w:val="22"/>
           <w:szCs w:val="22"/>
         </w:rPr>
-        <w:t>Name the table Request Tracker (or _</w:t>
-      </w:r>
-      <w:proofErr w:type="spellStart"/>
-      <w:r>
-        <w:rPr>
-          <w:rFonts w:ascii="Segoe UI" w:eastAsia="Segoe UI" w:hAnsi="Segoe UI" w:cs="Segoe UI"/>
-          <w:color w:val="333333"/>
-          <w:sz w:val="22"/>
-          <w:szCs w:val="22"/>
-        </w:rPr>
-        <w:t>RequestTracker</w:t>
-      </w:r>
-      <w:proofErr w:type="spellEnd"/>
-      <w:r>
-        <w:rPr>
-          <w:rFonts w:ascii="Segoe UI" w:eastAsia="Segoe UI" w:hAnsi="Segoe UI" w:cs="Segoe UI"/>
-          <w:color w:val="333333"/>
-          <w:sz w:val="22"/>
-          <w:szCs w:val="22"/>
-        </w:rPr>
-        <w:t>). Set the primary column name to Title.</w:t>
+        <w:t>Name the table Request Tracker (or _RequestTracker). Set the primary column name to Title.</w:t>
       </w:r>
     </w:p>
     <w:p>
@@ -9777,27 +11223,7 @@
           <w:sz w:val="22"/>
           <w:szCs w:val="22"/>
         </w:rPr>
-        <w:t xml:space="preserve">For the Priority column: click + New column, name </w:t>
-      </w:r>
-      <w:proofErr w:type="gramStart"/>
-      <w:r>
-        <w:rPr>
-          <w:rFonts w:ascii="Segoe UI" w:eastAsia="Segoe UI" w:hAnsi="Segoe UI" w:cs="Segoe UI"/>
-          <w:color w:val="333333"/>
-          <w:sz w:val="22"/>
-          <w:szCs w:val="22"/>
-        </w:rPr>
-        <w:t>it</w:t>
-      </w:r>
-      <w:proofErr w:type="gramEnd"/>
-      <w:r>
-        <w:rPr>
-          <w:rFonts w:ascii="Segoe UI" w:eastAsia="Segoe UI" w:hAnsi="Segoe UI" w:cs="Segoe UI"/>
-          <w:color w:val="333333"/>
-          <w:sz w:val="22"/>
-          <w:szCs w:val="22"/>
-        </w:rPr>
-        <w:t xml:space="preserve"> “Priority”, select Choice as the data type, and add these options: Low, Medium, High, Critical.</w:t>
+        <w:t>For the Priority column: click + New column, name it “Priority”, select Choice as the data type, and add these options: Low, Medium, High, Critical.</w:t>
       </w:r>
     </w:p>
     <w:p>
@@ -9814,7 +11240,6 @@
           <w:sz w:val="22"/>
           <w:szCs w:val="22"/>
         </w:rPr>
-        <w:lastRenderedPageBreak/>
         <w:t xml:space="preserve">6. </w:t>
       </w:r>
       <w:r>
@@ -9824,27 +11249,7 @@
           <w:sz w:val="22"/>
           <w:szCs w:val="22"/>
         </w:rPr>
-        <w:t xml:space="preserve">For the Status column: click + New column, name </w:t>
-      </w:r>
-      <w:proofErr w:type="gramStart"/>
-      <w:r>
-        <w:rPr>
-          <w:rFonts w:ascii="Segoe UI" w:eastAsia="Segoe UI" w:hAnsi="Segoe UI" w:cs="Segoe UI"/>
-          <w:color w:val="333333"/>
-          <w:sz w:val="22"/>
-          <w:szCs w:val="22"/>
-        </w:rPr>
-        <w:t>it</w:t>
-      </w:r>
-      <w:proofErr w:type="gramEnd"/>
-      <w:r>
-        <w:rPr>
-          <w:rFonts w:ascii="Segoe UI" w:eastAsia="Segoe UI" w:hAnsi="Segoe UI" w:cs="Segoe UI"/>
-          <w:color w:val="333333"/>
-          <w:sz w:val="22"/>
-          <w:szCs w:val="22"/>
-        </w:rPr>
-        <w:t xml:space="preserve"> “Status”, select Choice as the data type, and add these options: New, In Progress, Blocked, Completed.</w:t>
+        <w:t>For the Status column: click + New column, name it “Status”, select Choice as the data type, and add these options: New, In Progress, Blocked, Completed.</w:t>
       </w:r>
     </w:p>
     <w:p>
@@ -10675,7 +12080,6 @@
                 <w:rFonts w:ascii="Segoe UI" w:eastAsia="Segoe UI" w:hAnsi="Segoe UI" w:cs="Segoe UI"/>
                 <w:color w:val="333333"/>
               </w:rPr>
-              <w:lastRenderedPageBreak/>
               <w:t>Description</w:t>
             </w:r>
           </w:p>
@@ -10866,7 +12270,6 @@
             </w:tcMar>
           </w:tcPr>
           <w:p>
-            <w:proofErr w:type="spellStart"/>
             <w:r>
               <w:rPr>
                 <w:rFonts w:ascii="Segoe UI" w:eastAsia="Segoe UI" w:hAnsi="Segoe UI" w:cs="Segoe UI"/>
@@ -10874,7 +12277,6 @@
               </w:rPr>
               <w:t>AssignedTo</w:t>
             </w:r>
-            <w:proofErr w:type="spellEnd"/>
           </w:p>
         </w:tc>
         <w:tc>
@@ -10998,7 +12400,6 @@
             </w:tcMar>
           </w:tcPr>
           <w:p>
-            <w:proofErr w:type="spellStart"/>
             <w:r>
               <w:rPr>
                 <w:rFonts w:ascii="Segoe UI" w:eastAsia="Segoe UI" w:hAnsi="Segoe UI" w:cs="Segoe UI"/>
@@ -11006,7 +12407,6 @@
               </w:rPr>
               <w:t>DueDate</w:t>
             </w:r>
-            <w:proofErr w:type="spellEnd"/>
           </w:p>
         </w:tc>
         <w:tc>
@@ -11365,21 +12765,12 @@
             </w:tcMar>
           </w:tcPr>
           <w:p>
-            <w:proofErr w:type="gramStart"/>
-            <w:r>
-              <w:rPr>
-                <w:rFonts w:ascii="Segoe UI" w:eastAsia="Segoe UI" w:hAnsi="Segoe UI" w:cs="Segoe UI"/>
-                <w:color w:val="333333"/>
-              </w:rPr>
-              <w:t>int(</w:t>
-            </w:r>
-            <w:proofErr w:type="gramEnd"/>
-            <w:r>
-              <w:rPr>
-                <w:rFonts w:ascii="Segoe UI" w:eastAsia="Segoe UI" w:hAnsi="Segoe UI" w:cs="Segoe UI"/>
-                <w:color w:val="333333"/>
-              </w:rPr>
-              <w:t>Priority) — convert to integer</w:t>
+            <w:r>
+              <w:rPr>
+                <w:rFonts w:ascii="Segoe UI" w:eastAsia="Segoe UI" w:hAnsi="Segoe UI" w:cs="Segoe UI"/>
+                <w:color w:val="333333"/>
+              </w:rPr>
+              <w:t>int(Priority) — convert to integer</w:t>
             </w:r>
           </w:p>
         </w:tc>
@@ -11418,21 +12809,12 @@
             </w:tcMar>
           </w:tcPr>
           <w:p>
-            <w:proofErr w:type="gramStart"/>
-            <w:r>
-              <w:rPr>
-                <w:rFonts w:ascii="Segoe UI" w:eastAsia="Segoe UI" w:hAnsi="Segoe UI" w:cs="Segoe UI"/>
-                <w:color w:val="333333"/>
-              </w:rPr>
-              <w:t>int(</w:t>
-            </w:r>
-            <w:proofErr w:type="gramEnd"/>
-            <w:r>
-              <w:rPr>
-                <w:rFonts w:ascii="Segoe UI" w:eastAsia="Segoe UI" w:hAnsi="Segoe UI" w:cs="Segoe UI"/>
-                <w:color w:val="333333"/>
-              </w:rPr>
-              <w:t>Status) — convert to integer</w:t>
+            <w:r>
+              <w:rPr>
+                <w:rFonts w:ascii="Segoe UI" w:eastAsia="Segoe UI" w:hAnsi="Segoe UI" w:cs="Segoe UI"/>
+                <w:color w:val="333333"/>
+              </w:rPr>
+              <w:t>int(Status) — convert to integer</w:t>
             </w:r>
           </w:p>
         </w:tc>
@@ -11471,21 +12853,12 @@
             </w:tcMar>
           </w:tcPr>
           <w:p>
-            <w:proofErr w:type="spellStart"/>
-            <w:r>
-              <w:rPr>
-                <w:rFonts w:ascii="Segoe UI" w:eastAsia="Segoe UI" w:hAnsi="Segoe UI" w:cs="Segoe UI"/>
-                <w:color w:val="333333"/>
-              </w:rPr>
-              <w:t>AssignedTo</w:t>
-            </w:r>
-            <w:proofErr w:type="spellEnd"/>
-            <w:r>
-              <w:rPr>
-                <w:rFonts w:ascii="Segoe UI" w:eastAsia="Segoe UI" w:hAnsi="Segoe UI" w:cs="Segoe UI"/>
-                <w:color w:val="333333"/>
-              </w:rPr>
-              <w:t xml:space="preserve"> (from trigger)</w:t>
+            <w:r>
+              <w:rPr>
+                <w:rFonts w:ascii="Segoe UI" w:eastAsia="Segoe UI" w:hAnsi="Segoe UI" w:cs="Segoe UI"/>
+                <w:color w:val="333333"/>
+              </w:rPr>
+              <w:t>AssignedTo (from trigger)</w:t>
             </w:r>
           </w:p>
         </w:tc>
@@ -11568,21 +12941,12 @@
             </w:tcMar>
           </w:tcPr>
           <w:p>
-            <w:proofErr w:type="spellStart"/>
-            <w:r>
-              <w:rPr>
-                <w:rFonts w:ascii="Segoe UI" w:eastAsia="Segoe UI" w:hAnsi="Segoe UI" w:cs="Segoe UI"/>
-                <w:color w:val="333333"/>
-              </w:rPr>
-              <w:t>DueDate</w:t>
-            </w:r>
-            <w:proofErr w:type="spellEnd"/>
-            <w:r>
-              <w:rPr>
-                <w:rFonts w:ascii="Segoe UI" w:eastAsia="Segoe UI" w:hAnsi="Segoe UI" w:cs="Segoe UI"/>
-                <w:color w:val="333333"/>
-              </w:rPr>
-              <w:t xml:space="preserve"> (from trigger)</w:t>
+            <w:r>
+              <w:rPr>
+                <w:rFonts w:ascii="Segoe UI" w:eastAsia="Segoe UI" w:hAnsi="Segoe UI" w:cs="Segoe UI"/>
+                <w:color w:val="333333"/>
+              </w:rPr>
+              <w:t>DueDate (from trigger)</w:t>
             </w:r>
           </w:p>
         </w:tc>
@@ -11621,62 +12985,12 @@
             </w:tcMar>
           </w:tcPr>
           <w:p>
-            <w:proofErr w:type="spellStart"/>
-            <w:r>
-              <w:rPr>
-                <w:rFonts w:ascii="Segoe UI" w:eastAsia="Segoe UI" w:hAnsi="Segoe UI" w:cs="Segoe UI"/>
-                <w:color w:val="333333"/>
-              </w:rPr>
-              <w:t>formatDateTime</w:t>
-            </w:r>
-            <w:proofErr w:type="spellEnd"/>
-            <w:r>
-              <w:rPr>
-                <w:rFonts w:ascii="Segoe UI" w:eastAsia="Segoe UI" w:hAnsi="Segoe UI" w:cs="Segoe UI"/>
-                <w:color w:val="333333"/>
-              </w:rPr>
-              <w:t>(</w:t>
-            </w:r>
-            <w:proofErr w:type="spellStart"/>
-            <w:proofErr w:type="gramStart"/>
-            <w:r>
-              <w:rPr>
-                <w:rFonts w:ascii="Segoe UI" w:eastAsia="Segoe UI" w:hAnsi="Segoe UI" w:cs="Segoe UI"/>
-                <w:color w:val="333333"/>
-              </w:rPr>
-              <w:t>utcNow</w:t>
-            </w:r>
-            <w:proofErr w:type="spellEnd"/>
-            <w:r>
-              <w:rPr>
-                <w:rFonts w:ascii="Segoe UI" w:eastAsia="Segoe UI" w:hAnsi="Segoe UI" w:cs="Segoe UI"/>
-                <w:color w:val="333333"/>
-              </w:rPr>
-              <w:t>(</w:t>
-            </w:r>
-            <w:proofErr w:type="gramEnd"/>
-            <w:r>
-              <w:rPr>
-                <w:rFonts w:ascii="Segoe UI" w:eastAsia="Segoe UI" w:hAnsi="Segoe UI" w:cs="Segoe UI"/>
-                <w:color w:val="333333"/>
-              </w:rPr>
-              <w:t>), '</w:t>
-            </w:r>
-            <w:proofErr w:type="spellStart"/>
-            <w:r>
-              <w:rPr>
-                <w:rFonts w:ascii="Segoe UI" w:eastAsia="Segoe UI" w:hAnsi="Segoe UI" w:cs="Segoe UI"/>
-                <w:color w:val="333333"/>
-              </w:rPr>
-              <w:t>yyyy</w:t>
-            </w:r>
-            <w:proofErr w:type="spellEnd"/>
-            <w:r>
-              <w:rPr>
-                <w:rFonts w:ascii="Segoe UI" w:eastAsia="Segoe UI" w:hAnsi="Segoe UI" w:cs="Segoe UI"/>
-                <w:color w:val="333333"/>
-              </w:rPr>
-              <w:t>-MM-dd') — auto-set to today</w:t>
+            <w:r>
+              <w:rPr>
+                <w:rFonts w:ascii="Segoe UI" w:eastAsia="Segoe UI" w:hAnsi="Segoe UI" w:cs="Segoe UI"/>
+                <w:color w:val="333333"/>
+              </w:rPr>
+              <w:t>formatDateTime(utcNow(), 'yyyy-MM-dd') — auto-set to today</w:t>
             </w:r>
           </w:p>
         </w:tc>
@@ -11707,27 +13021,7 @@
           <w:sz w:val="22"/>
           <w:szCs w:val="22"/>
         </w:rPr>
-        <w:t xml:space="preserve">For Priority and Status, use the </w:t>
-      </w:r>
-      <w:proofErr w:type="gramStart"/>
-      <w:r>
-        <w:rPr>
-          <w:rFonts w:ascii="Segoe UI" w:eastAsia="Segoe UI" w:hAnsi="Segoe UI" w:cs="Segoe UI"/>
-          <w:color w:val="333333"/>
-          <w:sz w:val="22"/>
-          <w:szCs w:val="22"/>
-        </w:rPr>
-        <w:t>int(</w:t>
-      </w:r>
-      <w:proofErr w:type="gramEnd"/>
-      <w:r>
-        <w:rPr>
-          <w:rFonts w:ascii="Segoe UI" w:eastAsia="Segoe UI" w:hAnsi="Segoe UI" w:cs="Segoe UI"/>
-          <w:color w:val="333333"/>
-          <w:sz w:val="22"/>
-          <w:szCs w:val="22"/>
-        </w:rPr>
-        <w:t>) expression to convert the text value to a number, since Choice columns expect integer values.</w:t>
+        <w:t>For Priority and Status, use the int() expression to convert the text value to a number, since Choice columns expect integer values.</w:t>
       </w:r>
     </w:p>
     <w:p>
@@ -12207,7 +13501,6 @@
           <w:sz w:val="36"/>
           <w:szCs w:val="36"/>
         </w:rPr>
-        <w:lastRenderedPageBreak/>
         <w:t>Part 6: Create the “Get Row from Dataverse” Cloud Flow</w:t>
       </w:r>
     </w:p>
@@ -12288,27 +13581,7 @@
           <w:sz w:val="22"/>
           <w:szCs w:val="22"/>
         </w:rPr>
-        <w:t xml:space="preserve">Add one input parameter to the trigger: </w:t>
-      </w:r>
-      <w:proofErr w:type="spellStart"/>
-      <w:r>
-        <w:rPr>
-          <w:rFonts w:ascii="Segoe UI" w:eastAsia="Segoe UI" w:hAnsi="Segoe UI" w:cs="Segoe UI"/>
-          <w:color w:val="333333"/>
-          <w:sz w:val="22"/>
-          <w:szCs w:val="22"/>
-        </w:rPr>
-        <w:t>RecordID</w:t>
-      </w:r>
-      <w:proofErr w:type="spellEnd"/>
-      <w:r>
-        <w:rPr>
-          <w:rFonts w:ascii="Segoe UI" w:eastAsia="Segoe UI" w:hAnsi="Segoe UI" w:cs="Segoe UI"/>
-          <w:color w:val="333333"/>
-          <w:sz w:val="22"/>
-          <w:szCs w:val="22"/>
-        </w:rPr>
-        <w:t xml:space="preserve"> (Text) — the unique identifier of the request to fetch.</w:t>
+        <w:t>Add one input parameter to the trigger: RecordID (Text) — the unique identifier of the request to fetch.</w:t>
       </w:r>
     </w:p>
     <w:p>
@@ -12426,27 +13699,7 @@
           <w:sz w:val="22"/>
           <w:szCs w:val="22"/>
         </w:rPr>
-        <w:t xml:space="preserve">Set the Row ID to the </w:t>
-      </w:r>
-      <w:proofErr w:type="spellStart"/>
-      <w:r>
-        <w:rPr>
-          <w:rFonts w:ascii="Segoe UI" w:eastAsia="Segoe UI" w:hAnsi="Segoe UI" w:cs="Segoe UI"/>
-          <w:color w:val="333333"/>
-          <w:sz w:val="22"/>
-          <w:szCs w:val="22"/>
-        </w:rPr>
-        <w:t>RecordID</w:t>
-      </w:r>
-      <w:proofErr w:type="spellEnd"/>
-      <w:r>
-        <w:rPr>
-          <w:rFonts w:ascii="Segoe UI" w:eastAsia="Segoe UI" w:hAnsi="Segoe UI" w:cs="Segoe UI"/>
-          <w:color w:val="333333"/>
-          <w:sz w:val="22"/>
-          <w:szCs w:val="22"/>
-        </w:rPr>
-        <w:t xml:space="preserve"> dynamic content from the trigger.</w:t>
+        <w:t>Set the Row ID to the RecordID dynamic content from the trigger.</w:t>
       </w:r>
     </w:p>
     <w:p>
@@ -12858,7 +14111,6 @@
             </w:tcMar>
           </w:tcPr>
           <w:p>
-            <w:proofErr w:type="spellStart"/>
             <w:r>
               <w:rPr>
                 <w:rFonts w:ascii="Segoe UI" w:eastAsia="Segoe UI" w:hAnsi="Segoe UI" w:cs="Segoe UI"/>
@@ -12866,7 +14118,6 @@
               </w:rPr>
               <w:t>AssignedTo</w:t>
             </w:r>
-            <w:proofErr w:type="spellEnd"/>
           </w:p>
         </w:tc>
         <w:tc>
@@ -12925,7 +14176,6 @@
             </w:tcMar>
           </w:tcPr>
           <w:p>
-            <w:proofErr w:type="spellStart"/>
             <w:r>
               <w:rPr>
                 <w:rFonts w:ascii="Segoe UI" w:eastAsia="Segoe UI" w:hAnsi="Segoe UI" w:cs="Segoe UI"/>
@@ -12933,7 +14183,6 @@
               </w:rPr>
               <w:t>DueDate</w:t>
             </w:r>
-            <w:proofErr w:type="spellEnd"/>
           </w:p>
         </w:tc>
         <w:tc>
@@ -12969,46 +14218,12 @@
             </w:tcMar>
           </w:tcPr>
           <w:p>
-            <w:proofErr w:type="spellStart"/>
-            <w:proofErr w:type="gramStart"/>
-            <w:r>
-              <w:rPr>
-                <w:rFonts w:ascii="Segoe UI" w:eastAsia="Segoe UI" w:hAnsi="Segoe UI" w:cs="Segoe UI"/>
-                <w:color w:val="333333"/>
-              </w:rPr>
-              <w:t>formatDateTime</w:t>
-            </w:r>
-            <w:proofErr w:type="spellEnd"/>
-            <w:r>
-              <w:rPr>
-                <w:rFonts w:ascii="Segoe UI" w:eastAsia="Segoe UI" w:hAnsi="Segoe UI" w:cs="Segoe UI"/>
-                <w:color w:val="333333"/>
-              </w:rPr>
-              <w:t>(</w:t>
-            </w:r>
-            <w:proofErr w:type="gramEnd"/>
-            <w:r>
-              <w:rPr>
-                <w:rFonts w:ascii="Segoe UI" w:eastAsia="Segoe UI" w:hAnsi="Segoe UI" w:cs="Segoe UI"/>
-                <w:color w:val="333333"/>
-              </w:rPr>
-              <w:t>Due Date, '</w:t>
-            </w:r>
-            <w:proofErr w:type="spellStart"/>
-            <w:r>
-              <w:rPr>
-                <w:rFonts w:ascii="Segoe UI" w:eastAsia="Segoe UI" w:hAnsi="Segoe UI" w:cs="Segoe UI"/>
-                <w:color w:val="333333"/>
-              </w:rPr>
-              <w:t>yyyy</w:t>
-            </w:r>
-            <w:proofErr w:type="spellEnd"/>
-            <w:r>
-              <w:rPr>
-                <w:rFonts w:ascii="Segoe UI" w:eastAsia="Segoe UI" w:hAnsi="Segoe UI" w:cs="Segoe UI"/>
-                <w:color w:val="333333"/>
-              </w:rPr>
-              <w:t>-MM-dd')</w:t>
+            <w:r>
+              <w:rPr>
+                <w:rFonts w:ascii="Segoe UI" w:eastAsia="Segoe UI" w:hAnsi="Segoe UI" w:cs="Segoe UI"/>
+                <w:color w:val="333333"/>
+              </w:rPr>
+              <w:t>formatDateTime(Due Date, 'yyyy-MM-dd')</w:t>
             </w:r>
           </w:p>
         </w:tc>
@@ -13026,7 +14241,6 @@
             </w:tcMar>
           </w:tcPr>
           <w:p>
-            <w:proofErr w:type="spellStart"/>
             <w:r>
               <w:rPr>
                 <w:rFonts w:ascii="Segoe UI" w:eastAsia="Segoe UI" w:hAnsi="Segoe UI" w:cs="Segoe UI"/>
@@ -13034,7 +14248,6 @@
               </w:rPr>
               <w:t>SubmittedDate</w:t>
             </w:r>
-            <w:proofErr w:type="spellEnd"/>
           </w:p>
         </w:tc>
         <w:tc>
@@ -13384,23 +14597,7 @@
                 <w:rFonts w:ascii="Segoe UI" w:eastAsia="Segoe UI" w:hAnsi="Segoe UI" w:cs="Segoe UI"/>
                 <w:color w:val="333333"/>
               </w:rPr>
-              <w:t xml:space="preserve">Receives the </w:t>
-            </w:r>
-            <w:proofErr w:type="spellStart"/>
-            <w:r>
-              <w:rPr>
-                <w:rFonts w:ascii="Segoe UI" w:eastAsia="Segoe UI" w:hAnsi="Segoe UI" w:cs="Segoe UI"/>
-                <w:color w:val="333333"/>
-              </w:rPr>
-              <w:t>RecordID</w:t>
-            </w:r>
-            <w:proofErr w:type="spellEnd"/>
-            <w:r>
-              <w:rPr>
-                <w:rFonts w:ascii="Segoe UI" w:eastAsia="Segoe UI" w:hAnsi="Segoe UI" w:cs="Segoe UI"/>
-                <w:color w:val="333333"/>
-              </w:rPr>
-              <w:t xml:space="preserve"> input</w:t>
+              <w:t>Receives the RecordID input</w:t>
             </w:r>
           </w:p>
         </w:tc>
@@ -13561,7 +14758,6 @@
           <w:sz w:val="22"/>
           <w:szCs w:val="22"/>
         </w:rPr>
-        <w:lastRenderedPageBreak/>
         <w:t>This flow updates an existing request record in Dataverse when a user submits changes through the edit form.</w:t>
       </w:r>
     </w:p>
@@ -13740,7 +14936,6 @@
             </w:tcMar>
           </w:tcPr>
           <w:p>
-            <w:proofErr w:type="spellStart"/>
             <w:r>
               <w:rPr>
                 <w:rFonts w:ascii="Segoe UI" w:eastAsia="Segoe UI" w:hAnsi="Segoe UI" w:cs="Segoe UI"/>
@@ -13748,7 +14943,6 @@
               </w:rPr>
               <w:t>RecordID</w:t>
             </w:r>
-            <w:proofErr w:type="spellEnd"/>
           </w:p>
         </w:tc>
         <w:tc>
@@ -14067,7 +15261,6 @@
             </w:tcMar>
           </w:tcPr>
           <w:p>
-            <w:proofErr w:type="spellStart"/>
             <w:r>
               <w:rPr>
                 <w:rFonts w:ascii="Segoe UI" w:eastAsia="Segoe UI" w:hAnsi="Segoe UI" w:cs="Segoe UI"/>
@@ -14075,7 +15268,6 @@
               </w:rPr>
               <w:t>AssignedTo</w:t>
             </w:r>
-            <w:proofErr w:type="spellEnd"/>
           </w:p>
         </w:tc>
         <w:tc>
@@ -14134,7 +15326,6 @@
             </w:tcMar>
           </w:tcPr>
           <w:p>
-            <w:proofErr w:type="spellStart"/>
             <w:r>
               <w:rPr>
                 <w:rFonts w:ascii="Segoe UI" w:eastAsia="Segoe UI" w:hAnsi="Segoe UI" w:cs="Segoe UI"/>
@@ -14142,7 +15333,6 @@
               </w:rPr>
               <w:t>DueDate</w:t>
             </w:r>
-            <w:proofErr w:type="spellEnd"/>
           </w:p>
         </w:tc>
         <w:tc>
@@ -14304,27 +15494,7 @@
           <w:sz w:val="22"/>
           <w:szCs w:val="22"/>
         </w:rPr>
-        <w:t xml:space="preserve">Set the Row ID to </w:t>
-      </w:r>
-      <w:proofErr w:type="spellStart"/>
-      <w:r>
-        <w:rPr>
-          <w:rFonts w:ascii="Segoe UI" w:eastAsia="Segoe UI" w:hAnsi="Segoe UI" w:cs="Segoe UI"/>
-          <w:color w:val="333333"/>
-          <w:sz w:val="22"/>
-          <w:szCs w:val="22"/>
-        </w:rPr>
-        <w:t>RecordID</w:t>
-      </w:r>
-      <w:proofErr w:type="spellEnd"/>
-      <w:r>
-        <w:rPr>
-          <w:rFonts w:ascii="Segoe UI" w:eastAsia="Segoe UI" w:hAnsi="Segoe UI" w:cs="Segoe UI"/>
-          <w:color w:val="333333"/>
-          <w:sz w:val="22"/>
-          <w:szCs w:val="22"/>
-        </w:rPr>
-        <w:t xml:space="preserve"> from the trigger.</w:t>
+        <w:t>Set the Row ID to RecordID from the trigger.</w:t>
       </w:r>
     </w:p>
     <w:p>
@@ -14547,21 +15717,12 @@
             </w:tcMar>
           </w:tcPr>
           <w:p>
-            <w:proofErr w:type="gramStart"/>
-            <w:r>
-              <w:rPr>
-                <w:rFonts w:ascii="Segoe UI" w:eastAsia="Segoe UI" w:hAnsi="Segoe UI" w:cs="Segoe UI"/>
-                <w:color w:val="333333"/>
-              </w:rPr>
-              <w:t>int(</w:t>
-            </w:r>
-            <w:proofErr w:type="gramEnd"/>
-            <w:r>
-              <w:rPr>
-                <w:rFonts w:ascii="Segoe UI" w:eastAsia="Segoe UI" w:hAnsi="Segoe UI" w:cs="Segoe UI"/>
-                <w:color w:val="333333"/>
-              </w:rPr>
-              <w:t>Priority) — convert to integer</w:t>
+            <w:r>
+              <w:rPr>
+                <w:rFonts w:ascii="Segoe UI" w:eastAsia="Segoe UI" w:hAnsi="Segoe UI" w:cs="Segoe UI"/>
+                <w:color w:val="333333"/>
+              </w:rPr>
+              <w:t>int(Priority) — convert to integer</w:t>
             </w:r>
           </w:p>
         </w:tc>
@@ -14600,21 +15761,12 @@
             </w:tcMar>
           </w:tcPr>
           <w:p>
-            <w:proofErr w:type="gramStart"/>
-            <w:r>
-              <w:rPr>
-                <w:rFonts w:ascii="Segoe UI" w:eastAsia="Segoe UI" w:hAnsi="Segoe UI" w:cs="Segoe UI"/>
-                <w:color w:val="333333"/>
-              </w:rPr>
-              <w:t>int(</w:t>
-            </w:r>
-            <w:proofErr w:type="gramEnd"/>
-            <w:r>
-              <w:rPr>
-                <w:rFonts w:ascii="Segoe UI" w:eastAsia="Segoe UI" w:hAnsi="Segoe UI" w:cs="Segoe UI"/>
-                <w:color w:val="333333"/>
-              </w:rPr>
-              <w:t>Status) — convert to integer</w:t>
+            <w:r>
+              <w:rPr>
+                <w:rFonts w:ascii="Segoe UI" w:eastAsia="Segoe UI" w:hAnsi="Segoe UI" w:cs="Segoe UI"/>
+                <w:color w:val="333333"/>
+              </w:rPr>
+              <w:t>int(Status) — convert to integer</w:t>
             </w:r>
           </w:p>
         </w:tc>
@@ -14653,21 +15805,12 @@
             </w:tcMar>
           </w:tcPr>
           <w:p>
-            <w:proofErr w:type="spellStart"/>
-            <w:r>
-              <w:rPr>
-                <w:rFonts w:ascii="Segoe UI" w:eastAsia="Segoe UI" w:hAnsi="Segoe UI" w:cs="Segoe UI"/>
-                <w:color w:val="333333"/>
-              </w:rPr>
-              <w:t>AssignedTo</w:t>
-            </w:r>
-            <w:proofErr w:type="spellEnd"/>
-            <w:r>
-              <w:rPr>
-                <w:rFonts w:ascii="Segoe UI" w:eastAsia="Segoe UI" w:hAnsi="Segoe UI" w:cs="Segoe UI"/>
-                <w:color w:val="333333"/>
-              </w:rPr>
-              <w:t xml:space="preserve"> (from trigger)</w:t>
+            <w:r>
+              <w:rPr>
+                <w:rFonts w:ascii="Segoe UI" w:eastAsia="Segoe UI" w:hAnsi="Segoe UI" w:cs="Segoe UI"/>
+                <w:color w:val="333333"/>
+              </w:rPr>
+              <w:t>AssignedTo (from trigger)</w:t>
             </w:r>
           </w:p>
         </w:tc>
@@ -14706,21 +15849,12 @@
             </w:tcMar>
           </w:tcPr>
           <w:p>
-            <w:proofErr w:type="spellStart"/>
-            <w:r>
-              <w:rPr>
-                <w:rFonts w:ascii="Segoe UI" w:eastAsia="Segoe UI" w:hAnsi="Segoe UI" w:cs="Segoe UI"/>
-                <w:color w:val="333333"/>
-              </w:rPr>
-              <w:t>DueDate</w:t>
-            </w:r>
-            <w:proofErr w:type="spellEnd"/>
-            <w:r>
-              <w:rPr>
-                <w:rFonts w:ascii="Segoe UI" w:eastAsia="Segoe UI" w:hAnsi="Segoe UI" w:cs="Segoe UI"/>
-                <w:color w:val="333333"/>
-              </w:rPr>
-              <w:t xml:space="preserve"> (from trigger)</w:t>
+            <w:r>
+              <w:rPr>
+                <w:rFonts w:ascii="Segoe UI" w:eastAsia="Segoe UI" w:hAnsi="Segoe UI" w:cs="Segoe UI"/>
+                <w:color w:val="333333"/>
+              </w:rPr>
+              <w:t>DueDate (from trigger)</w:t>
             </w:r>
           </w:p>
         </w:tc>
@@ -15004,23 +16138,7 @@
                 <w:rFonts w:ascii="Segoe UI" w:eastAsia="Segoe UI" w:hAnsi="Segoe UI" w:cs="Segoe UI"/>
                 <w:color w:val="333333"/>
               </w:rPr>
-              <w:t xml:space="preserve">Receives </w:t>
-            </w:r>
-            <w:proofErr w:type="spellStart"/>
-            <w:r>
-              <w:rPr>
-                <w:rFonts w:ascii="Segoe UI" w:eastAsia="Segoe UI" w:hAnsi="Segoe UI" w:cs="Segoe UI"/>
-                <w:color w:val="333333"/>
-              </w:rPr>
-              <w:t>RecordID</w:t>
-            </w:r>
-            <w:proofErr w:type="spellEnd"/>
-            <w:r>
-              <w:rPr>
-                <w:rFonts w:ascii="Segoe UI" w:eastAsia="Segoe UI" w:hAnsi="Segoe UI" w:cs="Segoe UI"/>
-                <w:color w:val="333333"/>
-              </w:rPr>
-              <w:t xml:space="preserve"> + 6 field values</w:t>
+              <w:t>Receives RecordID + 6 field values</w:t>
             </w:r>
           </w:p>
         </w:tc>
@@ -15108,7 +16226,6 @@
                 <w:rFonts w:ascii="Segoe UI" w:eastAsia="Segoe UI" w:hAnsi="Segoe UI" w:cs="Segoe UI"/>
                 <w:color w:val="333333"/>
               </w:rPr>
-              <w:lastRenderedPageBreak/>
               <w:t>3</w:t>
             </w:r>
           </w:p>
@@ -15248,27 +16365,7 @@
           <w:sz w:val="22"/>
           <w:szCs w:val="22"/>
         </w:rPr>
-        <w:t xml:space="preserve">Add one input parameter to the trigger: </w:t>
-      </w:r>
-      <w:proofErr w:type="spellStart"/>
-      <w:r>
-        <w:rPr>
-          <w:rFonts w:ascii="Segoe UI" w:eastAsia="Segoe UI" w:hAnsi="Segoe UI" w:cs="Segoe UI"/>
-          <w:color w:val="333333"/>
-          <w:sz w:val="22"/>
-          <w:szCs w:val="22"/>
-        </w:rPr>
-        <w:t>UserDisplayName</w:t>
-      </w:r>
-      <w:proofErr w:type="spellEnd"/>
-      <w:r>
-        <w:rPr>
-          <w:rFonts w:ascii="Segoe UI" w:eastAsia="Segoe UI" w:hAnsi="Segoe UI" w:cs="Segoe UI"/>
-          <w:color w:val="333333"/>
-          <w:sz w:val="22"/>
-          <w:szCs w:val="22"/>
-        </w:rPr>
-        <w:t xml:space="preserve"> (Text) — the display name of the signed-in user.</w:t>
+        <w:t>Add one input parameter to the trigger: UserDisplayName (Text) — the display name of the signed-in user.</w:t>
       </w:r>
     </w:p>
     <w:p>
@@ -15360,87 +16457,7 @@
           <w:sz w:val="22"/>
           <w:szCs w:val="22"/>
         </w:rPr>
-        <w:t xml:space="preserve">In the Inputs field, enter a JSON object containing an array of sample records. Each record should </w:t>
-      </w:r>
-      <w:proofErr w:type="gramStart"/>
-      <w:r>
-        <w:rPr>
-          <w:rFonts w:ascii="Segoe UI" w:eastAsia="Segoe UI" w:hAnsi="Segoe UI" w:cs="Segoe UI"/>
-          <w:color w:val="333333"/>
-          <w:sz w:val="22"/>
-          <w:szCs w:val="22"/>
-        </w:rPr>
-        <w:t>include:</w:t>
-      </w:r>
-      <w:proofErr w:type="gramEnd"/>
-      <w:r>
-        <w:rPr>
-          <w:rFonts w:ascii="Segoe UI" w:eastAsia="Segoe UI" w:hAnsi="Segoe UI" w:cs="Segoe UI"/>
-          <w:color w:val="333333"/>
-          <w:sz w:val="22"/>
-          <w:szCs w:val="22"/>
-        </w:rPr>
-        <w:t xml:space="preserve"> title, description, priority (number), status (number), </w:t>
-      </w:r>
-      <w:proofErr w:type="spellStart"/>
-      <w:r>
-        <w:rPr>
-          <w:rFonts w:ascii="Segoe UI" w:eastAsia="Segoe UI" w:hAnsi="Segoe UI" w:cs="Segoe UI"/>
-          <w:color w:val="333333"/>
-          <w:sz w:val="22"/>
-          <w:szCs w:val="22"/>
-        </w:rPr>
-        <w:t>assignedTo</w:t>
-      </w:r>
-      <w:proofErr w:type="spellEnd"/>
-      <w:r>
-        <w:rPr>
-          <w:rFonts w:ascii="Segoe UI" w:eastAsia="Segoe UI" w:hAnsi="Segoe UI" w:cs="Segoe UI"/>
-          <w:color w:val="333333"/>
-          <w:sz w:val="22"/>
-          <w:szCs w:val="22"/>
-        </w:rPr>
-        <w:t xml:space="preserve">, requestor (use the </w:t>
-      </w:r>
-      <w:proofErr w:type="spellStart"/>
-      <w:r>
-        <w:rPr>
-          <w:rFonts w:ascii="Segoe UI" w:eastAsia="Segoe UI" w:hAnsi="Segoe UI" w:cs="Segoe UI"/>
-          <w:color w:val="333333"/>
-          <w:sz w:val="22"/>
-          <w:szCs w:val="22"/>
-        </w:rPr>
-        <w:t>UserDisplayName</w:t>
-      </w:r>
-      <w:proofErr w:type="spellEnd"/>
-      <w:r>
-        <w:rPr>
-          <w:rFonts w:ascii="Segoe UI" w:eastAsia="Segoe UI" w:hAnsi="Segoe UI" w:cs="Segoe UI"/>
-          <w:color w:val="333333"/>
-          <w:sz w:val="22"/>
-          <w:szCs w:val="22"/>
-        </w:rPr>
-        <w:t xml:space="preserve"> dynamic content), and </w:t>
-      </w:r>
-      <w:proofErr w:type="spellStart"/>
-      <w:r>
-        <w:rPr>
-          <w:rFonts w:ascii="Segoe UI" w:eastAsia="Segoe UI" w:hAnsi="Segoe UI" w:cs="Segoe UI"/>
-          <w:color w:val="333333"/>
-          <w:sz w:val="22"/>
-          <w:szCs w:val="22"/>
-        </w:rPr>
-        <w:t>dueDate</w:t>
-      </w:r>
-      <w:proofErr w:type="spellEnd"/>
-      <w:r>
-        <w:rPr>
-          <w:rFonts w:ascii="Segoe UI" w:eastAsia="Segoe UI" w:hAnsi="Segoe UI" w:cs="Segoe UI"/>
-          <w:color w:val="333333"/>
-          <w:sz w:val="22"/>
-          <w:szCs w:val="22"/>
-        </w:rPr>
-        <w:t>. Include 5–10 diverse sample records with varying priorities and statuses.</w:t>
+        <w:t>In the Inputs field, enter a JSON object containing an array of sample records. Each record should include: title, description, priority (number), status (number), assignedTo, requestor (use the UserDisplayName dynamic content), and dueDate. Include 5–10 diverse sample records with varying priorities and statuses.</w:t>
       </w:r>
     </w:p>
     <w:p>
@@ -15506,27 +16523,7 @@
           <w:sz w:val="22"/>
           <w:szCs w:val="22"/>
         </w:rPr>
-        <w:t>Set the input to the records array from the Compose output (e.g., outputs(’Compose’</w:t>
-      </w:r>
-      <w:proofErr w:type="gramStart"/>
-      <w:r>
-        <w:rPr>
-          <w:rFonts w:ascii="Segoe UI" w:eastAsia="Segoe UI" w:hAnsi="Segoe UI" w:cs="Segoe UI"/>
-          <w:color w:val="333333"/>
-          <w:sz w:val="22"/>
-          <w:szCs w:val="22"/>
-        </w:rPr>
-        <w:t>)?[</w:t>
-      </w:r>
-      <w:proofErr w:type="gramEnd"/>
-      <w:r>
-        <w:rPr>
-          <w:rFonts w:ascii="Segoe UI" w:eastAsia="Segoe UI" w:hAnsi="Segoe UI" w:cs="Segoe UI"/>
-          <w:color w:val="333333"/>
-          <w:sz w:val="22"/>
-          <w:szCs w:val="22"/>
-        </w:rPr>
-        <w:t>’records’]).</w:t>
+        <w:t>Set the input to the records array from the Compose output (e.g., outputs(’Compose’)?[’records’]).</w:t>
       </w:r>
     </w:p>
     <w:p>
@@ -15578,47 +16575,7 @@
           <w:sz w:val="22"/>
           <w:szCs w:val="22"/>
         </w:rPr>
-        <w:t>Map each field from the current loop item (e.g., items(’</w:t>
-      </w:r>
-      <w:proofErr w:type="spellStart"/>
-      <w:r>
-        <w:rPr>
-          <w:rFonts w:ascii="Segoe UI" w:eastAsia="Segoe UI" w:hAnsi="Segoe UI" w:cs="Segoe UI"/>
-          <w:color w:val="333333"/>
-          <w:sz w:val="22"/>
-          <w:szCs w:val="22"/>
-        </w:rPr>
-        <w:t>Apply_to_each</w:t>
-      </w:r>
-      <w:proofErr w:type="spellEnd"/>
-      <w:r>
-        <w:rPr>
-          <w:rFonts w:ascii="Segoe UI" w:eastAsia="Segoe UI" w:hAnsi="Segoe UI" w:cs="Segoe UI"/>
-          <w:color w:val="333333"/>
-          <w:sz w:val="22"/>
-          <w:szCs w:val="22"/>
-        </w:rPr>
-        <w:t>’</w:t>
-      </w:r>
-      <w:proofErr w:type="gramStart"/>
-      <w:r>
-        <w:rPr>
-          <w:rFonts w:ascii="Segoe UI" w:eastAsia="Segoe UI" w:hAnsi="Segoe UI" w:cs="Segoe UI"/>
-          <w:color w:val="333333"/>
-          <w:sz w:val="22"/>
-          <w:szCs w:val="22"/>
-        </w:rPr>
-        <w:t>)?[</w:t>
-      </w:r>
-      <w:proofErr w:type="gramEnd"/>
-      <w:r>
-        <w:rPr>
-          <w:rFonts w:ascii="Segoe UI" w:eastAsia="Segoe UI" w:hAnsi="Segoe UI" w:cs="Segoe UI"/>
-          <w:color w:val="333333"/>
-          <w:sz w:val="22"/>
-          <w:szCs w:val="22"/>
-        </w:rPr>
-        <w:t>’title’]) to the corresponding table column.</w:t>
+        <w:t>Map each field from the current loop item (e.g., items(’Apply_to_each’)?[’title’]) to the corresponding table column.</w:t>
       </w:r>
     </w:p>
     <w:p>
@@ -15792,7 +16749,6 @@
           <w:sz w:val="28"/>
           <w:szCs w:val="28"/>
         </w:rPr>
-        <w:lastRenderedPageBreak/>
         <w:t>Option 1: Using Generative Actions (Recommended)</w:t>
       </w:r>
     </w:p>
@@ -16196,27 +17152,7 @@
           <w:sz w:val="22"/>
           <w:szCs w:val="22"/>
         </w:rPr>
-        <w:t xml:space="preserve">The original agent uses advanced patterns including Adaptive Card forms, AI Builder prompts for duplicate detection, and Power </w:t>
-      </w:r>
-      <w:proofErr w:type="spellStart"/>
-      <w:r>
-        <w:rPr>
-          <w:rFonts w:ascii="Segoe UI" w:eastAsia="Segoe UI" w:hAnsi="Segoe UI" w:cs="Segoe UI"/>
-          <w:color w:val="333333"/>
-          <w:sz w:val="22"/>
-          <w:szCs w:val="22"/>
-        </w:rPr>
-        <w:t>Fx</w:t>
-      </w:r>
-      <w:proofErr w:type="spellEnd"/>
-      <w:r>
-        <w:rPr>
-          <w:rFonts w:ascii="Segoe UI" w:eastAsia="Segoe UI" w:hAnsi="Segoe UI" w:cs="Segoe UI"/>
-          <w:color w:val="333333"/>
-          <w:sz w:val="22"/>
-          <w:szCs w:val="22"/>
-        </w:rPr>
-        <w:t xml:space="preserve"> expressions. These are optional enhancements you can add later.</w:t>
+        <w:t>The original agent uses advanced patterns including Adaptive Card forms, AI Builder prompts for duplicate detection, and Power Fx expressions. These are optional enhancements you can add later.</w:t>
       </w:r>
     </w:p>
     <w:p>
@@ -16351,7 +17287,6 @@
           <w:sz w:val="22"/>
           <w:szCs w:val="22"/>
         </w:rPr>
-        <w:lastRenderedPageBreak/>
         <w:t xml:space="preserve">5. </w:t>
       </w:r>
       <w:r>
@@ -16396,7 +17331,6 @@
           <w:sz w:val="52"/>
           <w:szCs w:val="52"/>
         </w:rPr>
-        <w:lastRenderedPageBreak/>
         <w:t>6. Make It Your Own</w:t>
       </w:r>
     </w:p>
@@ -17135,7 +18069,6 @@
           <w:sz w:val="52"/>
           <w:szCs w:val="52"/>
         </w:rPr>
-        <w:lastRenderedPageBreak/>
         <w:t>7. Test That It Works</w:t>
       </w:r>
     </w:p>
@@ -17742,23 +18675,7 @@
                 <w:rFonts w:ascii="Segoe UI" w:eastAsia="Segoe UI" w:hAnsi="Segoe UI" w:cs="Segoe UI"/>
                 <w:color w:val="333333"/>
               </w:rPr>
-              <w:t xml:space="preserve">Verify the Dataverse knowledge source is </w:t>
-            </w:r>
-            <w:proofErr w:type="gramStart"/>
-            <w:r>
-              <w:rPr>
-                <w:rFonts w:ascii="Segoe UI" w:eastAsia="Segoe UI" w:hAnsi="Segoe UI" w:cs="Segoe UI"/>
-                <w:color w:val="333333"/>
-              </w:rPr>
-              <w:t>enabled</w:t>
-            </w:r>
-            <w:proofErr w:type="gramEnd"/>
-            <w:r>
-              <w:rPr>
-                <w:rFonts w:ascii="Segoe UI" w:eastAsia="Segoe UI" w:hAnsi="Segoe UI" w:cs="Segoe UI"/>
-                <w:color w:val="333333"/>
-              </w:rPr>
-              <w:t xml:space="preserve"> and semantic search is turned on. Wait a few minutes for indexing.</w:t>
+              <w:t>Verify the Dataverse knowledge source is enabled and semantic search is turned on. Wait a few minutes for indexing.</w:t>
             </w:r>
           </w:p>
         </w:tc>
@@ -17846,23 +18763,7 @@
                 <w:rFonts w:ascii="Segoe UI" w:eastAsia="Segoe UI" w:hAnsi="Segoe UI" w:cs="Segoe UI"/>
                 <w:color w:val="333333"/>
               </w:rPr>
-              <w:t xml:space="preserve">Ensure the topic is correctly configured with an </w:t>
-            </w:r>
-            <w:proofErr w:type="spellStart"/>
-            <w:r>
-              <w:rPr>
-                <w:rFonts w:ascii="Segoe UI" w:eastAsia="Segoe UI" w:hAnsi="Segoe UI" w:cs="Segoe UI"/>
-                <w:color w:val="333333"/>
-              </w:rPr>
-              <w:t>AdaptiveCardPrompt</w:t>
-            </w:r>
-            <w:proofErr w:type="spellEnd"/>
-            <w:r>
-              <w:rPr>
-                <w:rFonts w:ascii="Segoe UI" w:eastAsia="Segoe UI" w:hAnsi="Segoe UI" w:cs="Segoe UI"/>
-                <w:color w:val="333333"/>
-              </w:rPr>
-              <w:t xml:space="preserve"> node. Check that the card JSON is valid.</w:t>
+              <w:t>Ensure the topic is correctly configured with an AdaptiveCardPrompt node. Check that the card JSON is valid.</w:t>
             </w:r>
           </w:p>
         </w:tc>
@@ -18069,7 +18970,6 @@
           <w:sz w:val="22"/>
           <w:szCs w:val="22"/>
         </w:rPr>
-        <w:lastRenderedPageBreak/>
         <w:t>For a deeper test, a dedicated set of evaluation test files are available alongside the agent package:</w:t>
       </w:r>
     </w:p>

</xml_diff>